<commit_message>
docs: sync project document with eval regression gate
- command table and quality table mention eval --compare
- regenerate the Word deliverable and the Pages project page from the updated source

Signed-off-by: ThomasZhang <alphejangs@gmail.com>
</commit_message>
<xml_diff>
--- a/docs/exports/kubectl-triage-project-v0.5.0.docx
+++ b/docs/exports/kubectl-triage-project-v0.5.0.docx
@@ -2509,6 +2509,21 @@
                 <w:sz w:val="16"/>
               </w:rPr>
               <w:t>--min-cases</w:t>
+            </w:r>
+            <w:r>
+              <w:rPr>
+                <w:rFonts w:ascii="Helvetica Neue" w:hAnsi="Helvetica Neue" w:eastAsia="PingFang SC"/>
+                <w:sz w:val="18"/>
+              </w:rPr>
+              <w:t>、</w:t>
+            </w:r>
+            <w:r>
+              <w:rPr>
+                <w:rFonts w:ascii="Menlo" w:hAnsi="Menlo" w:eastAsia="PingFang SC"/>
+                <w:color w:val="24292E"/>
+                <w:sz w:val="16"/>
+              </w:rPr>
+              <w:t>--compare</w:t>
             </w:r>
             <w:r>
               <w:rPr>
@@ -4714,7 +4729,22 @@
                 <w:rFonts w:ascii="Helvetica Neue" w:hAnsi="Helvetica Neue" w:eastAsia="PingFang SC"/>
                 <w:sz w:val="18"/>
               </w:rPr>
-              <w:t xml:space="preserve"> 集合结构门禁</w:t>
+              <w:t xml:space="preserve"> 集合结构门禁 + </w:t>
+            </w:r>
+            <w:r>
+              <w:rPr>
+                <w:rFonts w:ascii="Menlo" w:hAnsi="Menlo" w:eastAsia="PingFang SC"/>
+                <w:color w:val="24292E"/>
+                <w:sz w:val="16"/>
+              </w:rPr>
+              <w:t>--compare</w:t>
+            </w:r>
+            <w:r>
+              <w:rPr>
+                <w:rFonts w:ascii="Helvetica Neue" w:hAnsi="Helvetica Neue" w:eastAsia="PingFang SC"/>
+                <w:sz w:val="18"/>
+              </w:rPr>
+              <w:t xml:space="preserve"> 基线回归门禁</w:t>
             </w:r>
           </w:p>
         </w:tc>

</xml_diff>

<commit_message>
docs: make project document bilingual with English default
- docs/PROJECT.md is now English with a switcher; Chinese moves to
  docs/PROJECT-zh.md (same structure, 12 tables, identical facts)
- docx generator gains --source/--output/--lang/--all and emits English and
  Chinese deliverables (kubectl-triage-project-v0.5.0[-zh].docx)
- both DOCX exports regenerated and structure-validated

Signed-off-by: ThomasZhang <alphejangs@gmail.com>
</commit_message>
<xml_diff>
--- a/docs/exports/kubectl-triage-project-v0.5.0.docx
+++ b/docs/exports/kubectl-triage-project-v0.5.0.docx
@@ -32,7 +32,7 @@
           <w:color w:val="1F2A44"/>
           <w:sz w:val="44"/>
         </w:rPr>
-        <w:t>项目文档</w:t>
+        <w:t>Project Documentation</w:t>
       </w:r>
     </w:p>
     <w:p>
@@ -46,7 +46,7 @@
           <w:color w:val="595959"/>
           <w:sz w:val="24"/>
         </w:rPr>
-        <w:t>轻量、离线优先的 Kubernetes 事故诊断 CLI</w:t>
+        <w:t>Lightweight, offline-first Kubernetes incident triage CLI</w:t>
       </w:r>
     </w:p>
     <w:p>
@@ -60,7 +60,7 @@
           <w:color w:val="333333"/>
           <w:sz w:val="22"/>
         </w:rPr>
-        <w:t>版本 v0.5.0   ·   2026-10-30   ·   Apache-2.0</w:t>
+        <w:t>Version v0.5.0   ·   2026-10-30   ·   Apache-2.0</w:t>
       </w:r>
     </w:p>
     <w:p>
@@ -87,12 +87,36 @@
           <w:color w:val="595959"/>
           <w:sz w:val="18"/>
         </w:rPr>
-        <w:t>本文档由仓库 docs/PROJECT.md 渲染生成，详细口径以各 ADR 与文档为准。</w:t>
+        <w:t>This document is rendered from docs/PROJECT.md in the repository; detailed rules follow the linked ADRs and documents.</w:t>
       </w:r>
     </w:p>
     <w:p>
       <w:r>
         <w:br w:type="page"/>
+      </w:r>
+    </w:p>
+    <w:p>
+      <w:r>
+        <w:rPr>
+          <w:rFonts w:ascii="Helvetica Neue" w:hAnsi="Helvetica Neue" w:eastAsia="PingFang SC"/>
+          <w:sz w:val="21"/>
+        </w:rPr>
+        <w:t xml:space="preserve">English | </w:t>
+      </w:r>
+      <w:r>
+        <w:rPr>
+          <w:rFonts w:ascii="Helvetica Neue" w:hAnsi="Helvetica Neue" w:eastAsia="PingFang SC"/>
+          <w:sz w:val="21"/>
+        </w:rPr>
+        <w:t>简体中文</w:t>
+      </w:r>
+      <w:r>
+        <w:rPr>
+          <w:rFonts w:ascii="Helvetica Neue" w:hAnsi="Helvetica Neue" w:eastAsia="PingFang SC"/>
+          <w:color w:val="595959"/>
+          <w:sz w:val="18"/>
+        </w:rPr>
+        <w:t xml:space="preserve"> (PROJECT-zh.md)</w:t>
       </w:r>
     </w:p>
     <w:p>
@@ -110,7 +134,7 @@
           <w:color w:val="595959"/>
           <w:sz w:val="19"/>
         </w:rPr>
-        <w:t>版本 v0.5.0</w:t>
+        <w:t>Version v0.5.0</w:t>
       </w:r>
       <w:r>
         <w:rPr>
@@ -124,26 +148,12 @@
         <w:br/>
       </w:r>
       <w:r>
-        <w:br/>
-      </w:r>
-      <w:r>
         <w:rPr>
           <w:rFonts w:ascii="Helvetica Neue" w:hAnsi="Helvetica Neue" w:eastAsia="PingFang SC"/>
           <w:color w:val="595959"/>
           <w:sz w:val="19"/>
         </w:rPr>
-        <w:t>本文档是项目的综合说明与事实源入口：定位、架构、数据契约、命令、安全、质量、里程碑与路线图。</w:t>
-      </w:r>
-      <w:r>
-        <w:br/>
-      </w:r>
-      <w:r>
-        <w:rPr>
-          <w:rFonts w:ascii="Helvetica Neue" w:hAnsi="Helvetica Neue" w:eastAsia="PingFang SC"/>
-          <w:color w:val="595959"/>
-          <w:sz w:val="19"/>
-        </w:rPr>
-        <w:t>详细口径以各链接文档与 ADR 为准。</w:t>
+        <w:t>This document is the consolidated project description and the entry point to the facts: positioning, architecture, data contracts, commands, security, quality, milestones and roadmap. Detailed rules are defined by the linked documents and ADRs.</w:t>
       </w:r>
     </w:p>
     <w:p>
@@ -151,7 +161,7 @@
         <w:pStyle w:val="Heading1"/>
       </w:pPr>
       <w:r>
-        <w:t>1. 项目定位</w:t>
+        <w:t>1. Project Positioning</w:t>
       </w:r>
     </w:p>
     <w:p>
@@ -160,7 +170,7 @@
           <w:rFonts w:ascii="Helvetica Neue" w:hAnsi="Helvetica Neue" w:eastAsia="PingFang SC"/>
           <w:sz w:val="21"/>
         </w:rPr>
-        <w:t>kubectl-triage 是一个</w:t>
+        <w:t xml:space="preserve">kubectl-triage is a </w:t>
       </w:r>
       <w:r>
         <w:rPr>
@@ -168,14 +178,29 @@
           <w:b/>
           <w:sz w:val="21"/>
         </w:rPr>
-        <w:t>轻量、离线优先的 Kubernetes 事故诊断 CLI</w:t>
+        <w:t>lightweight, offline-first Kubernetes incident triage CLI</w:t>
       </w:r>
       <w:r>
         <w:rPr>
           <w:rFonts w:ascii="Helvetica Neue" w:hAnsi="Helvetica Neue" w:eastAsia="PingFang SC"/>
           <w:sz w:val="21"/>
         </w:rPr>
-        <w:t>：开发者拿到一份脱敏的事故证据包，</w:t>
+        <w:t xml:space="preserve">: a developer takes a redacted incident evidence bundle, runs a single command locally, and gets a </w:t>
+      </w:r>
+      <w:r>
+        <w:rPr>
+          <w:rFonts w:ascii="Helvetica Neue" w:hAnsi="Helvetica Neue" w:eastAsia="PingFang SC"/>
+          <w:b/>
+          <w:sz w:val="21"/>
+        </w:rPr>
+        <w:t>reproducible, traceable and reviewable</w:t>
+      </w:r>
+      <w:r>
+        <w:rPr>
+          <w:rFonts w:ascii="Helvetica Neue" w:hAnsi="Helvetica Neue" w:eastAsia="PingFang SC"/>
+          <w:sz w:val="21"/>
+        </w:rPr>
+        <w:t xml:space="preserve"> Markdown/JSON diagnosis report — without a control plane, without uploading production evidence, and without an account.</w:t>
       </w:r>
     </w:p>
     <w:p>
@@ -184,40 +209,7 @@
           <w:rFonts w:ascii="Helvetica Neue" w:hAnsi="Helvetica Neue" w:eastAsia="PingFang SC"/>
           <w:sz w:val="21"/>
         </w:rPr>
-        <w:t>在本地执行一条命令，得到一份</w:t>
-      </w:r>
-      <w:r>
-        <w:rPr>
-          <w:rFonts w:ascii="Helvetica Neue" w:hAnsi="Helvetica Neue" w:eastAsia="PingFang SC"/>
-          <w:b/>
-          <w:sz w:val="21"/>
-        </w:rPr>
-        <w:t>可复现、可追溯、可评审</w:t>
-      </w:r>
-      <w:r>
-        <w:rPr>
-          <w:rFonts w:ascii="Helvetica Neue" w:hAnsi="Helvetica Neue" w:eastAsia="PingFang SC"/>
-          <w:sz w:val="21"/>
-        </w:rPr>
-        <w:t>的 Markdown/JSON 诊断报告——不依赖控制平面、</w:t>
-      </w:r>
-    </w:p>
-    <w:p>
-      <w:r>
-        <w:rPr>
-          <w:rFonts w:ascii="Helvetica Neue" w:hAnsi="Helvetica Neue" w:eastAsia="PingFang SC"/>
-          <w:sz w:val="21"/>
-        </w:rPr>
-        <w:t>不上传生产证据、不要求账号。</w:t>
-      </w:r>
-    </w:p>
-    <w:p>
-      <w:r>
-        <w:rPr>
-          <w:rFonts w:ascii="Helvetica Neue" w:hAnsi="Helvetica Neue" w:eastAsia="PingFang SC"/>
-          <w:sz w:val="21"/>
-        </w:rPr>
-        <w:t>产品承诺：</w:t>
+        <w:t>Product promises:</w:t>
       </w:r>
     </w:p>
     <w:p>
@@ -230,14 +222,14 @@
           <w:b/>
           <w:sz w:val="21"/>
         </w:rPr>
-        <w:t>5 分钟内完成第一次本地诊断</w:t>
+        <w:t>First local diagnosis in under 5 minutes</w:t>
       </w:r>
       <w:r>
         <w:rPr>
           <w:rFonts w:ascii="Helvetica Neue" w:hAnsi="Helvetica Neue" w:eastAsia="PingFang SC"/>
           <w:sz w:val="21"/>
         </w:rPr>
-        <w:t>：无账号、无登录、无云端依赖，</w:t>
+        <w:t xml:space="preserve">: no account, no login, no cloud dependency; </w:t>
       </w:r>
       <w:r>
         <w:rPr>
@@ -252,7 +244,7 @@
           <w:rFonts w:ascii="Helvetica Neue" w:hAnsi="Helvetica Neue" w:eastAsia="PingFang SC"/>
           <w:sz w:val="21"/>
         </w:rPr>
-        <w:t xml:space="preserve"> 生成可跑通示例；</w:t>
+        <w:t xml:space="preserve"> generates a runnable example;</w:t>
       </w:r>
     </w:p>
     <w:p>
@@ -265,14 +257,14 @@
           <w:b/>
           <w:sz w:val="21"/>
         </w:rPr>
-        <w:t>历史事故可复盘</w:t>
+        <w:t>Historical incidents can be reviewed</w:t>
       </w:r>
       <w:r>
         <w:rPr>
           <w:rFonts w:ascii="Helvetica Neue" w:hAnsi="Helvetica Neue" w:eastAsia="PingFang SC"/>
           <w:sz w:val="21"/>
         </w:rPr>
-        <w:t>：证据包可存档、可分享、可回归（golden + 本地 eval）；</w:t>
+        <w:t>: bundles are archivable, shareable and replayable (golden + local eval);</w:t>
       </w:r>
     </w:p>
     <w:p>
@@ -285,14 +277,14 @@
           <w:b/>
           <w:sz w:val="21"/>
         </w:rPr>
-        <w:t>可信度来自证据</w:t>
+        <w:t>Credibility comes from evidence</w:t>
       </w:r>
       <w:r>
         <w:rPr>
           <w:rFonts w:ascii="Helvetica Neue" w:hAnsi="Helvetica Neue" w:eastAsia="PingFang SC"/>
           <w:sz w:val="21"/>
         </w:rPr>
-        <w:t>：每条结论引用证据，并给出反证、缺失说明与置信分层，而不是模型口吻；</w:t>
+        <w:t>: every conclusion cites evidence and shows counter-evidence, missing-data notes and confidence tiers instead of model rhetoric;</w:t>
       </w:r>
     </w:p>
     <w:p>
@@ -305,14 +297,14 @@
           <w:b/>
           <w:sz w:val="21"/>
         </w:rPr>
-        <w:t>默认安全</w:t>
+        <w:t>Secure by default</w:t>
       </w:r>
       <w:r>
         <w:rPr>
           <w:rFonts w:ascii="Helvetica Neue" w:hAnsi="Helvetica Neue" w:eastAsia="PingFang SC"/>
           <w:sz w:val="21"/>
         </w:rPr>
-        <w:t>：默认零网络、只读、不读 Secret；模型与推送均为显式 opt-in。</w:t>
+        <w:t>: zero network, read-only, never reads Secrets; model and push are explicit opt-in.</w:t>
       </w:r>
     </w:p>
     <w:p>
@@ -320,7 +312,7 @@
         <w:pStyle w:val="Heading1"/>
       </w:pPr>
       <w:r>
-        <w:t>2. 目标用户与典型场景</w:t>
+        <w:t>2. Target Users and Typical Scenarios</w:t>
       </w:r>
     </w:p>
     <w:tbl>
@@ -348,7 +340,7 @@
                 <w:b/>
                 <w:sz w:val="18"/>
               </w:rPr>
-              <w:t>用户</w:t>
+              <w:t>User</w:t>
             </w:r>
           </w:p>
         </w:tc>
@@ -364,7 +356,7 @@
                 <w:b/>
                 <w:sz w:val="18"/>
               </w:rPr>
-              <w:t>场景</w:t>
+              <w:t>Scenario</w:t>
             </w:r>
           </w:p>
         </w:tc>
@@ -380,7 +372,7 @@
                 <w:b/>
                 <w:sz w:val="18"/>
               </w:rPr>
-              <w:t>成功标准</w:t>
+              <w:t>Success criterion</w:t>
             </w:r>
           </w:p>
         </w:tc>
@@ -396,7 +388,7 @@
                 <w:rFonts w:ascii="Helvetica Neue" w:hAnsi="Helvetica Neue" w:eastAsia="PingFang SC"/>
                 <w:sz w:val="18"/>
               </w:rPr>
-              <w:t>应用开发者</w:t>
+              <w:t>Application developer</w:t>
             </w:r>
           </w:p>
         </w:tc>
@@ -410,7 +402,7 @@
                 <w:rFonts w:ascii="Helvetica Neue" w:hAnsi="Helvetica Neue" w:eastAsia="PingFang SC"/>
                 <w:sz w:val="18"/>
               </w:rPr>
-              <w:t xml:space="preserve">收到告警，本地只有 </w:t>
+              <w:t xml:space="preserve">Receives an alert and only has local </w:t>
             </w:r>
             <w:r>
               <w:rPr>
@@ -425,7 +417,7 @@
                 <w:rFonts w:ascii="Helvetica Neue" w:hAnsi="Helvetica Neue" w:eastAsia="PingFang SC"/>
                 <w:sz w:val="18"/>
               </w:rPr>
-              <w:t xml:space="preserve"> 输出和几段日志</w:t>
+              <w:t xml:space="preserve"> output and a few log excerpts</w:t>
             </w:r>
           </w:p>
         </w:tc>
@@ -439,7 +431,7 @@
                 <w:rFonts w:ascii="Helvetica Neue" w:hAnsi="Helvetica Neue" w:eastAsia="PingFang SC"/>
                 <w:sz w:val="18"/>
               </w:rPr>
-              <w:t>不登平台即得到有证据的根因草稿</w:t>
+              <w:t>Gets an evidence-backed root-cause draft without logging into a platform</w:t>
             </w:r>
           </w:p>
         </w:tc>
@@ -455,7 +447,7 @@
                 <w:rFonts w:ascii="Helvetica Neue" w:hAnsi="Helvetica Neue" w:eastAsia="PingFang SC"/>
                 <w:sz w:val="18"/>
               </w:rPr>
-              <w:t>值班 SRE</w:t>
+              <w:t>On-call SRE</w:t>
             </w:r>
           </w:p>
         </w:tc>
@@ -469,7 +461,7 @@
                 <w:rFonts w:ascii="Helvetica Neue" w:hAnsi="Helvetica Neue" w:eastAsia="PingFang SC"/>
                 <w:sz w:val="18"/>
               </w:rPr>
-              <w:t>事故后复盘，需要证据与结论留档</w:t>
+              <w:t>Post-incident review; needs to archive evidence and conclusions</w:t>
             </w:r>
           </w:p>
         </w:tc>
@@ -483,7 +475,7 @@
                 <w:rFonts w:ascii="Helvetica Neue" w:hAnsi="Helvetica Neue" w:eastAsia="PingFang SC"/>
                 <w:sz w:val="18"/>
               </w:rPr>
-              <w:t>一份可审阅的 Markdown/JSON 报告</w:t>
+              <w:t>A reviewable Markdown/JSON report</w:t>
             </w:r>
           </w:p>
         </w:tc>
@@ -499,7 +491,7 @@
                 <w:rFonts w:ascii="Helvetica Neue" w:hAnsi="Helvetica Neue" w:eastAsia="PingFang SC"/>
                 <w:sz w:val="18"/>
               </w:rPr>
-              <w:t>平台工程师</w:t>
+              <w:t>Platform engineer</w:t>
             </w:r>
           </w:p>
         </w:tc>
@@ -513,7 +505,7 @@
                 <w:rFonts w:ascii="Helvetica Neue" w:hAnsi="Helvetica Neue" w:eastAsia="PingFang SC"/>
                 <w:sz w:val="18"/>
               </w:rPr>
-              <w:t>评估诊断工具是否值得团队采购</w:t>
+              <w:t>Evaluates whether the tool is worth adopting</w:t>
             </w:r>
           </w:p>
         </w:tc>
@@ -527,7 +519,7 @@
                 <w:rFonts w:ascii="Helvetica Neue" w:hAnsi="Helvetica Neue" w:eastAsia="PingFang SC"/>
                 <w:sz w:val="18"/>
               </w:rPr>
-              <w:t>用自己脱敏的历史事故复跑与评测</w:t>
+              <w:t>Replays and evaluates their own redacted historical incidents</w:t>
             </w:r>
           </w:p>
         </w:tc>
@@ -543,7 +535,7 @@
                 <w:rFonts w:ascii="Helvetica Neue" w:hAnsi="Helvetica Neue" w:eastAsia="PingFang SC"/>
                 <w:sz w:val="18"/>
               </w:rPr>
-              <w:t>安全/合规</w:t>
+              <w:t>Security/compliance</w:t>
             </w:r>
           </w:p>
         </w:tc>
@@ -557,7 +549,7 @@
                 <w:rFonts w:ascii="Helvetica Neue" w:hAnsi="Helvetica Neue" w:eastAsia="PingFang SC"/>
                 <w:sz w:val="18"/>
               </w:rPr>
-              <w:t>生产日志不能出域</w:t>
+              <w:t>Production logs must not leave the domain</w:t>
             </w:r>
           </w:p>
         </w:tc>
@@ -571,7 +563,7 @@
                 <w:rFonts w:ascii="Helvetica Neue" w:hAnsi="Helvetica Neue" w:eastAsia="PingFang SC"/>
                 <w:sz w:val="18"/>
               </w:rPr>
-              <w:t>离线模式运行、证据哈希可核验</w:t>
+              <w:t>Runs offline; evidence hashes can be verified</w:t>
             </w:r>
           </w:p>
         </w:tc>
@@ -587,7 +579,7 @@
                 <w:rFonts w:ascii="Helvetica Neue" w:hAnsi="Helvetica Neue" w:eastAsia="PingFang SC"/>
                 <w:sz w:val="18"/>
               </w:rPr>
-              <w:t>企业购买者</w:t>
+              <w:t>Enterprise buyer</w:t>
             </w:r>
           </w:p>
         </w:tc>
@@ -601,7 +593,7 @@
                 <w:rFonts w:ascii="Helvetica Neue" w:hAnsi="Helvetica Neue" w:eastAsia="PingFang SC"/>
                 <w:sz w:val="18"/>
               </w:rPr>
-              <w:t>团队需要事故库、评测与审计</w:t>
+              <w:t>The team needs an incident library, evaluation and audit</w:t>
             </w:r>
           </w:p>
         </w:tc>
@@ -615,7 +607,7 @@
                 <w:rFonts w:ascii="Helvetica Neue" w:hAnsi="Helvetica Neue" w:eastAsia="PingFang SC"/>
                 <w:sz w:val="18"/>
               </w:rPr>
-              <w:t>从 CLI 试点升级到企业版</w:t>
+              <w:t>Upgrades from the CLI pilot to the enterprise edition</w:t>
             </w:r>
           </w:p>
         </w:tc>
@@ -627,7 +619,7 @@
         <w:pStyle w:val="Heading1"/>
       </w:pPr>
       <w:r>
-        <w:t>3. 开源版与企业版边界</w:t>
+        <w:t>3. Open Source vs Enterprise Boundary</w:t>
       </w:r>
     </w:p>
     <w:p>
@@ -637,7 +629,7 @@
           <w:b/>
           <w:sz w:val="21"/>
         </w:rPr>
-        <w:t>开源 CLI 免费做“一次、本地、单事故”的诊断；企业版卖“团队、评测、审计、私有化”。</w:t>
+        <w:t>The open-source CLI performs "one incident, locally, once" for free; the enterprise edition sells "team, evaluation, audit and private deployment".</w:t>
       </w:r>
     </w:p>
     <w:tbl>
@@ -665,7 +657,7 @@
                 <w:b/>
                 <w:sz w:val="18"/>
               </w:rPr>
-              <w:t>能力</w:t>
+              <w:t>Capability</w:t>
             </w:r>
           </w:p>
         </w:tc>
@@ -681,7 +673,7 @@
                 <w:b/>
                 <w:sz w:val="18"/>
               </w:rPr>
-              <w:t>开源 CLI（免费）</w:t>
+              <w:t>Open-source CLI (free)</w:t>
             </w:r>
           </w:p>
         </w:tc>
@@ -697,7 +689,7 @@
                 <w:b/>
                 <w:sz w:val="18"/>
               </w:rPr>
-              <w:t>企业版（CloudOps Agent）</w:t>
+              <w:t>Enterprise edition (CloudOps Agent)</w:t>
             </w:r>
           </w:p>
         </w:tc>
@@ -713,7 +705,7 @@
                 <w:rFonts w:ascii="Helvetica Neue" w:hAnsi="Helvetica Neue" w:eastAsia="PingFang SC"/>
                 <w:sz w:val="18"/>
               </w:rPr>
-              <w:t>单次本地诊断 / 离线规则 / 可选模型 / MD+JSON 报告</w:t>
+              <w:t>Single local diagnosis / offline rules / optional model / MD+JSON report</w:t>
             </w:r>
           </w:p>
         </w:tc>
@@ -727,7 +719,7 @@
                 <w:rFonts w:ascii="Helvetica Neue" w:hAnsi="Helvetica Neue" w:eastAsia="PingFang SC"/>
                 <w:sz w:val="18"/>
               </w:rPr>
-              <w:t>✅ 不限次数</w:t>
+              <w:t>✅ Unlimited</w:t>
             </w:r>
           </w:p>
         </w:tc>
@@ -757,7 +749,7 @@
                 <w:rFonts w:ascii="Helvetica Neue" w:hAnsi="Helvetica Neue" w:eastAsia="PingFang SC"/>
                 <w:sz w:val="18"/>
               </w:rPr>
-              <w:t>本地 eval（golden + 正式集校验）</w:t>
+              <w:t>Local eval (golden + formal set validation)</w:t>
             </w:r>
           </w:p>
         </w:tc>
@@ -785,7 +777,7 @@
                 <w:rFonts w:ascii="Helvetica Neue" w:hAnsi="Helvetica Neue" w:eastAsia="PingFang SC"/>
                 <w:sz w:val="18"/>
               </w:rPr>
-              <w:t>✅（另有团队评测服务）</w:t>
+              <w:t>✅ (plus a team evaluation service)</w:t>
             </w:r>
           </w:p>
         </w:tc>
@@ -801,7 +793,7 @@
                 <w:rFonts w:ascii="Helvetica Neue" w:hAnsi="Helvetica Neue" w:eastAsia="PingFang SC"/>
                 <w:sz w:val="18"/>
               </w:rPr>
-              <w:t>团队事故库 / 检索 / 负责人</w:t>
+              <w:t>Team incident library / search / ownership</w:t>
             </w:r>
           </w:p>
         </w:tc>
@@ -845,7 +837,7 @@
                 <w:rFonts w:ascii="Helvetica Neue" w:hAnsi="Helvetica Neue" w:eastAsia="PingFang SC"/>
                 <w:sz w:val="18"/>
               </w:rPr>
-              <w:t>审计（谁在何时看了什么、模型/版本）</w:t>
+              <w:t>Audit (who viewed what and when, model/version)</w:t>
             </w:r>
           </w:p>
         </w:tc>
@@ -889,7 +881,7 @@
                 <w:rFonts w:ascii="Helvetica Neue" w:hAnsi="Helvetica Neue" w:eastAsia="PingFang SC"/>
                 <w:sz w:val="18"/>
               </w:rPr>
-              <w:t>SSO/RBAC/多租户/私有部署/SLA</w:t>
+              <w:t>SSO/RBAC/multi-tenancy/private deployment/SLA</w:t>
             </w:r>
           </w:p>
         </w:tc>
@@ -933,7 +925,7 @@
                 <w:rFonts w:ascii="Helvetica Neue" w:hAnsi="Helvetica Neue" w:eastAsia="PingFang SC"/>
                 <w:sz w:val="18"/>
               </w:rPr>
-              <w:t>企业推送</w:t>
+              <w:t>Enterprise push</w:t>
             </w:r>
           </w:p>
         </w:tc>
@@ -947,7 +939,7 @@
                 <w:rFonts w:ascii="Helvetica Neue" w:hAnsi="Helvetica Neue" w:eastAsia="PingFang SC"/>
                 <w:sz w:val="18"/>
               </w:rPr>
-              <w:t>✅ 客户端（显式 opt-in）</w:t>
+              <w:t>✅ Client (explicit opt-in)</w:t>
             </w:r>
           </w:p>
         </w:tc>
@@ -961,7 +953,7 @@
                 <w:rFonts w:ascii="Helvetica Neue" w:hAnsi="Helvetica Neue" w:eastAsia="PingFang SC"/>
                 <w:sz w:val="18"/>
               </w:rPr>
-              <w:t>✅ 服务端（库/去重/评测/审计）</w:t>
+              <w:t>✅ Server (library/dedup/evaluation/audit)</w:t>
             </w:r>
           </w:p>
         </w:tc>
@@ -974,14 +966,14 @@
           <w:rFonts w:ascii="Helvetica Neue" w:hAnsi="Helvetica Neue" w:eastAsia="PingFang SC"/>
           <w:sz w:val="21"/>
         </w:rPr>
-        <w:t xml:space="preserve">详细边界与 FAQ 见 </w:t>
+        <w:t xml:space="preserve">See </w:t>
       </w:r>
       <w:r>
         <w:rPr>
           <w:rFonts w:ascii="Helvetica Neue" w:hAnsi="Helvetica Neue" w:eastAsia="PingFang SC"/>
           <w:sz w:val="21"/>
         </w:rPr>
-        <w:t>企业版边界</w:t>
+        <w:t>Enterprise boundary (Chinese)</w:t>
       </w:r>
       <w:r>
         <w:rPr>
@@ -996,7 +988,7 @@
           <w:rFonts w:ascii="Helvetica Neue" w:hAnsi="Helvetica Neue" w:eastAsia="PingFang SC"/>
           <w:sz w:val="21"/>
         </w:rPr>
-        <w:t>；企业侧 G2–G5 不进入本仓库。</w:t>
+        <w:t xml:space="preserve"> for the detailed boundary and FAQ; enterprise-side G2–G5 do not live in this repository.</w:t>
       </w:r>
     </w:p>
     <w:p>
@@ -1004,7 +996,7 @@
         <w:pStyle w:val="Heading1"/>
       </w:pPr>
       <w:r>
-        <w:t>4. 核心概念</w:t>
+        <w:t>4. Core Concepts</w:t>
       </w:r>
     </w:p>
     <w:tbl>
@@ -1031,7 +1023,7 @@
                 <w:b/>
                 <w:sz w:val="18"/>
               </w:rPr>
-              <w:t>概念</w:t>
+              <w:t>Concept</w:t>
             </w:r>
           </w:p>
         </w:tc>
@@ -1047,7 +1039,7 @@
                 <w:b/>
                 <w:sz w:val="18"/>
               </w:rPr>
-              <w:t>说明</w:t>
+              <w:t>Description</w:t>
             </w:r>
           </w:p>
         </w:tc>
@@ -1064,7 +1056,7 @@
                 <w:b/>
                 <w:sz w:val="18"/>
               </w:rPr>
-              <w:t>事故包（bundle）</w:t>
+              <w:t>Incident bundle</w:t>
             </w:r>
           </w:p>
         </w:tc>
@@ -1078,7 +1070,7 @@
                 <w:rFonts w:ascii="Helvetica Neue" w:hAnsi="Helvetica Neue" w:eastAsia="PingFang SC"/>
                 <w:sz w:val="18"/>
               </w:rPr>
-              <w:t>一个目录：</w:t>
+              <w:t xml:space="preserve">A directory: </w:t>
             </w:r>
             <w:r>
               <w:rPr>
@@ -1093,7 +1085,7 @@
                 <w:rFonts w:ascii="Helvetica Neue" w:hAnsi="Helvetica Neue" w:eastAsia="PingFang SC"/>
                 <w:sz w:val="18"/>
               </w:rPr>
-              <w:t xml:space="preserve"> + 证据（k8s/metrics/logs/changes/alert.json）；本地、可存档</w:t>
+              <w:t xml:space="preserve"> + evidence (k8s/metrics/logs/changes/alert.json); local and archivable</w:t>
             </w:r>
           </w:p>
         </w:tc>
@@ -1110,7 +1102,7 @@
                 <w:b/>
                 <w:sz w:val="18"/>
               </w:rPr>
-              <w:t>证据（evidence）</w:t>
+              <w:t>Evidence</w:t>
             </w:r>
           </w:p>
         </w:tc>
@@ -1124,7 +1116,7 @@
                 <w:rFonts w:ascii="Helvetica Neue" w:hAnsi="Helvetica Neue" w:eastAsia="PingFang SC"/>
                 <w:sz w:val="18"/>
               </w:rPr>
-              <w:t>规范化条目：id / source / observed_at / collected_at / summary / content_ref / sha256 / stale</w:t>
+              <w:t>Normalized entries: id / source / observed_at / collected_at / summary / content_ref / sha256 / stale</w:t>
             </w:r>
           </w:p>
         </w:tc>
@@ -1141,7 +1133,7 @@
                 <w:b/>
                 <w:sz w:val="18"/>
               </w:rPr>
-              <w:t>报告（report）</w:t>
+              <w:t>Report</w:t>
             </w:r>
           </w:p>
         </w:tc>
@@ -1163,7 +1155,7 @@
                 <w:rFonts w:ascii="Helvetica Neue" w:hAnsi="Helvetica Neue" w:eastAsia="PingFang SC"/>
                 <w:sz w:val="18"/>
               </w:rPr>
-              <w:t xml:space="preserve">（schema_version 1.0，稳定接口）+ 由其渲染的 </w:t>
+              <w:t xml:space="preserve"> (schema_version 1.0, stable interface) + </w:t>
             </w:r>
             <w:r>
               <w:rPr>
@@ -1172,6 +1164,13 @@
                 <w:sz w:val="16"/>
               </w:rPr>
               <w:t>report.md</w:t>
+            </w:r>
+            <w:r>
+              <w:rPr>
+                <w:rFonts w:ascii="Helvetica Neue" w:hAnsi="Helvetica Neue" w:eastAsia="PingFang SC"/>
+                <w:sz w:val="18"/>
+              </w:rPr>
+              <w:t xml:space="preserve"> rendered from it</w:t>
             </w:r>
           </w:p>
         </w:tc>
@@ -1188,7 +1187,7 @@
                 <w:b/>
                 <w:sz w:val="18"/>
               </w:rPr>
-              <w:t>假设（hypothesis）</w:t>
+              <w:t>Hypothesis</w:t>
             </w:r>
           </w:p>
         </w:tc>
@@ -1202,7 +1201,7 @@
                 <w:rFonts w:ascii="Helvetica Neue" w:hAnsi="Helvetica Neue" w:eastAsia="PingFang SC"/>
                 <w:sz w:val="18"/>
               </w:rPr>
-              <w:t>最多 3 条，按置信排序；每条 ≥1 条有效证据；可带反证与缺失说明</w:t>
+              <w:t>At most 3, ranked by confidence; each cites at least 1 valid evidence item; may carry counter-evidence and missing-data notes</w:t>
             </w:r>
           </w:p>
         </w:tc>
@@ -1219,7 +1218,7 @@
                 <w:b/>
                 <w:sz w:val="18"/>
               </w:rPr>
-              <w:t>评测集（eval set）</w:t>
+              <w:t>Evaluation set</w:t>
             </w:r>
           </w:p>
         </w:tc>
@@ -1233,7 +1232,7 @@
                 <w:rFonts w:ascii="Helvetica Neue" w:hAnsi="Helvetica Neue" w:eastAsia="PingFang SC"/>
                 <w:sz w:val="18"/>
               </w:rPr>
-              <w:t xml:space="preserve">与事故包同构的用例集合 + </w:t>
+              <w:t xml:space="preserve">A case collection isomorphic to incident bundles + </w:t>
             </w:r>
             <w:r>
               <w:rPr>
@@ -1248,7 +1247,7 @@
                 <w:rFonts w:ascii="Helvetica Neue" w:hAnsi="Helvetica Neue" w:eastAsia="PingFang SC"/>
                 <w:sz w:val="18"/>
               </w:rPr>
-              <w:t>；golden 与正式 100 例共用契约</w:t>
+              <w:t>; golden and the formal 100 cases share the contract</w:t>
             </w:r>
           </w:p>
         </w:tc>
@@ -1265,7 +1264,7 @@
                 <w:b/>
                 <w:sz w:val="18"/>
               </w:rPr>
-              <w:t>企业推送（push）</w:t>
+              <w:t>Enterprise push</w:t>
             </w:r>
           </w:p>
         </w:tc>
@@ -1279,7 +1278,7 @@
                 <w:rFonts w:ascii="Helvetica Neue" w:hAnsi="Helvetica Neue" w:eastAsia="PingFang SC"/>
                 <w:sz w:val="18"/>
               </w:rPr>
-              <w:t>显式配置的客户端：默认只发报告 + 证据哈希，可选脱敏证据包；协议 v1.0 公开</w:t>
+              <w:t>Explicitly configured client: sends only the report + evidence hashes by default, optionally a redacted evidence bundle; protocol v1.0 is public</w:t>
             </w:r>
           </w:p>
         </w:tc>
@@ -1291,7 +1290,7 @@
         <w:pStyle w:val="Heading1"/>
       </w:pPr>
       <w:r>
-        <w:t>5. 系统架构</w:t>
+        <w:t>5. System Architecture</w:t>
       </w:r>
     </w:p>
     <w:p>
@@ -1299,7 +1298,7 @@
         <w:pStyle w:val="Heading2"/>
       </w:pPr>
       <w:r>
-        <w:t>5.1 模块</w:t>
+        <w:t>5.1 Modules</w:t>
       </w:r>
     </w:p>
     <w:tbl>
@@ -1326,7 +1325,7 @@
                 <w:b/>
                 <w:sz w:val="18"/>
               </w:rPr>
-              <w:t>模块</w:t>
+              <w:t>Module</w:t>
             </w:r>
           </w:p>
         </w:tc>
@@ -1342,7 +1341,7 @@
                 <w:b/>
                 <w:sz w:val="18"/>
               </w:rPr>
-              <w:t>职责</w:t>
+              <w:t>Responsibility</w:t>
             </w:r>
           </w:p>
         </w:tc>
@@ -1373,7 +1372,7 @@
                 <w:rFonts w:ascii="Helvetica Neue" w:hAnsi="Helvetica Neue" w:eastAsia="PingFang SC"/>
                 <w:sz w:val="18"/>
               </w:rPr>
-              <w:t xml:space="preserve">程序入口，装配 CLI 与版本信息（支持 </w:t>
+              <w:t xml:space="preserve">Program entry point; wires the CLI and version information (supports </w:t>
             </w:r>
             <w:r>
               <w:rPr>
@@ -1388,7 +1387,7 @@
                 <w:rFonts w:ascii="Helvetica Neue" w:hAnsi="Helvetica Neue" w:eastAsia="PingFang SC"/>
                 <w:sz w:val="18"/>
               </w:rPr>
-              <w:t xml:space="preserve"> 回退）</w:t>
+              <w:t xml:space="preserve"> fallback)</w:t>
             </w:r>
           </w:p>
         </w:tc>
@@ -1419,7 +1418,7 @@
                 <w:rFonts w:ascii="Helvetica Neue" w:hAnsi="Helvetica Neue" w:eastAsia="PingFang SC"/>
                 <w:sz w:val="18"/>
               </w:rPr>
-              <w:t>cobra 命令、flag、退出码、输出与人性化错误</w:t>
+              <w:t>cobra commands, flags, exit codes, output and human-friendly errors</w:t>
             </w:r>
           </w:p>
         </w:tc>
@@ -1450,7 +1449,7 @@
                 <w:rFonts w:ascii="Helvetica Neue" w:hAnsi="Helvetica Neue" w:eastAsia="PingFang SC"/>
                 <w:sz w:val="18"/>
               </w:rPr>
-              <w:t>事故包加载/校验/脚手架、路径穿越防护、strict/standard/off 脱敏模式</w:t>
+              <w:t>Bundle loading/validation/scaffolding, path-traversal protection, strict/standard/off redaction modes</w:t>
             </w:r>
           </w:p>
         </w:tc>
@@ -1481,7 +1480,7 @@
                 <w:rFonts w:ascii="Helvetica Neue" w:hAnsi="Helvetica Neue" w:eastAsia="PingFang SC"/>
                 <w:sz w:val="18"/>
               </w:rPr>
-              <w:t xml:space="preserve">凭据模式识别与 </w:t>
+              <w:t xml:space="preserve">Credential-pattern detection and </w:t>
             </w:r>
             <w:r>
               <w:rPr>
@@ -1496,7 +1495,7 @@
                 <w:rFonts w:ascii="Helvetica Neue" w:hAnsi="Helvetica Neue" w:eastAsia="PingFang SC"/>
                 <w:sz w:val="18"/>
               </w:rPr>
-              <w:t xml:space="preserve"> 清洗（导入前、推送前复用）</w:t>
+              <w:t xml:space="preserve"> scrubbing (reused before import and before push)</w:t>
             </w:r>
           </w:p>
         </w:tc>
@@ -1527,7 +1526,7 @@
                 <w:rFonts w:ascii="Helvetica Neue" w:hAnsi="Helvetica Neue" w:eastAsia="PingFang SC"/>
                 <w:sz w:val="18"/>
               </w:rPr>
-              <w:t>证据规范化：content_ref、时间、哈希、stale、时钟偏差、裁剪</w:t>
+              <w:t>Evidence normalization: content_ref, timestamps, hashes, stale, clock skew, trimming</w:t>
             </w:r>
           </w:p>
         </w:tc>
@@ -1558,7 +1557,7 @@
                 <w:rFonts w:ascii="Helvetica Neue" w:hAnsi="Helvetica Neue" w:eastAsia="PingFang SC"/>
                 <w:sz w:val="18"/>
               </w:rPr>
-              <w:t>分析编排：证据抽取、规则引擎、反证/置信/缺失、报告组装</w:t>
+              <w:t>Analysis orchestration: evidence extraction, rule engine, counter-evidence/confidence/missing data, report assembly</w:t>
             </w:r>
           </w:p>
         </w:tc>
@@ -1589,7 +1588,7 @@
                 <w:rFonts w:ascii="Helvetica Neue" w:hAnsi="Helvetica Neue" w:eastAsia="PingFang SC"/>
                 <w:sz w:val="18"/>
               </w:rPr>
-              <w:t>五类故障确定性规则（rule-v0.2）</w:t>
+              <w:t>Deterministic rules for the five failure classes (rule-v0.2)</w:t>
             </w:r>
           </w:p>
         </w:tc>
@@ -1620,7 +1619,7 @@
                 <w:rFonts w:ascii="Helvetica Neue" w:hAnsi="Helvetica Neue" w:eastAsia="PingFang SC"/>
                 <w:sz w:val="18"/>
               </w:rPr>
-              <w:t>可选模型：OpenAI-compatible/Ollama、预算/超时/重试、输出校验与中和</w:t>
+              <w:t>Optional model: OpenAI-compatible/Ollama, budget/timeout/retry, output validation and neutralization</w:t>
             </w:r>
           </w:p>
         </w:tc>
@@ -1651,7 +1650,7 @@
                 <w:rFonts w:ascii="Helvetica Neue" w:hAnsi="Helvetica Neue" w:eastAsia="PingFang SC"/>
                 <w:sz w:val="18"/>
               </w:rPr>
-              <w:t>报告结构、JSON 序列化、Markdown 渲染、schema 校验</w:t>
+              <w:t>Report structure, JSON serialization, Markdown rendering, schema validation</w:t>
             </w:r>
           </w:p>
         </w:tc>
@@ -1682,7 +1681,7 @@
                 <w:rFonts w:ascii="Helvetica Neue" w:hAnsi="Helvetica Neue" w:eastAsia="PingFang SC"/>
                 <w:sz w:val="18"/>
               </w:rPr>
-              <w:t>Alertmanager/kubectl/Prometheus/Loki 导入器（确定性归一化）</w:t>
+              <w:t>Alertmanager/kubectl/Prometheus/Loki importers (deterministic normalization)</w:t>
             </w:r>
           </w:p>
         </w:tc>
@@ -1713,7 +1712,7 @@
                 <w:rFonts w:ascii="Helvetica Neue" w:hAnsi="Helvetica Neue" w:eastAsia="PingFang SC"/>
                 <w:sz w:val="18"/>
               </w:rPr>
-              <w:t>本地评测：Top1/Top3/缺失/注入/降级评分、集合校验（</w:t>
+              <w:t>Local evaluation: Top1/Top3/missing/injection/degraded scoring, set validation (</w:t>
             </w:r>
             <w:r>
               <w:rPr>
@@ -1728,7 +1727,7 @@
                 <w:rFonts w:ascii="Helvetica Neue" w:hAnsi="Helvetica Neue" w:eastAsia="PingFang SC"/>
                 <w:sz w:val="18"/>
               </w:rPr>
-              <w:t>）</w:t>
+              <w:t>)</w:t>
             </w:r>
           </w:p>
         </w:tc>
@@ -1759,7 +1758,7 @@
                 <w:rFonts w:ascii="Helvetica Neue" w:hAnsi="Helvetica Neue" w:eastAsia="PingFang SC"/>
                 <w:sz w:val="18"/>
               </w:rPr>
-              <w:t>企业推送客户端：协议 1.0、幂等重试、dry-run、安全预检</w:t>
+              <w:t>Enterprise push client: protocol 1.0, idempotent retries, dry-run, security pre-flight</w:t>
             </w:r>
           </w:p>
         </w:tc>
@@ -1790,7 +1789,7 @@
                 <w:rFonts w:ascii="Helvetica Neue" w:hAnsi="Helvetica Neue" w:eastAsia="PingFang SC"/>
                 <w:sz w:val="18"/>
               </w:rPr>
-              <w:t>opt-in 匿名遥测：默认关闭、10 字段白名单、best-effort</w:t>
+              <w:t>Opt-in anonymous telemetry: disabled by default, 10-field allowlist, best-effort</w:t>
             </w:r>
           </w:p>
         </w:tc>
@@ -1821,7 +1820,7 @@
                 <w:rFonts w:ascii="Helvetica Neue" w:hAnsi="Helvetica Neue" w:eastAsia="PingFang SC"/>
                 <w:sz w:val="18"/>
               </w:rPr>
-              <w:t>公开 JSON Schema + 零依赖子集校验器 + 兼容性基线测试</w:t>
+              <w:t>Public JSON Schemas + zero-dependency subset validator + compatibility baseline tests</w:t>
             </w:r>
           </w:p>
         </w:tc>
@@ -1833,7 +1832,7 @@
         <w:pStyle w:val="Heading2"/>
       </w:pPr>
       <w:r>
-        <w:t>5.2 数据流</w:t>
+        <w:t>5.2 Data Flow</w:t>
       </w:r>
     </w:p>
     <w:p>
@@ -1848,7 +1847,7 @@
           <w:color w:val="24292E"/>
           <w:sz w:val="17"/>
         </w:rPr>
-        <w:t>事故包目录 ──► bundle(Load/Validate, redact) ──► evidence(规范化/裁剪)</w:t>
+        <w:t>bundle directory ──► bundle(Load/Validate, redact) ──► evidence(normalize/trim)</w:t>
         <w:br/>
       </w:r>
       <w:r>
@@ -1866,7 +1865,7 @@
           <w:color w:val="24292E"/>
           <w:sz w:val="17"/>
         </w:rPr>
-        <w:t xml:space="preserve">                                              ├─► rule 引擎（五类规则）──► 报告（离线）</w:t>
+        <w:t xml:space="preserve">                                              ├─► rule engine (five failure classes) ──► report (offline)</w:t>
         <w:br/>
       </w:r>
       <w:r>
@@ -1875,7 +1874,7 @@
           <w:color w:val="24292E"/>
           <w:sz w:val="17"/>
         </w:rPr>
-        <w:t xml:space="preserve">                                              └─► model(可选) ── 校验/中和 ──► 报告（增强/降级）</w:t>
+        <w:t xml:space="preserve">                                              └─► model(optional) ── validate/neutralize ──► report (enhanced/degraded)</w:t>
         <w:br/>
       </w:r>
       <w:r>
@@ -1884,7 +1883,7 @@
           <w:color w:val="24292E"/>
           <w:sz w:val="17"/>
         </w:rPr>
-        <w:t>报告 ◄──────────────────────────────────────────┘</w:t>
+        <w:t>report ◄──────────────────────────────────────────┘</w:t>
         <w:br/>
       </w:r>
       <w:r>
@@ -1893,7 +1892,7 @@
           <w:color w:val="24292E"/>
           <w:sz w:val="17"/>
         </w:rPr>
-        <w:t xml:space="preserve">  ├─► report.md / report.json（本地）</w:t>
+        <w:t xml:space="preserve">  ├─► report.md / report.json (local)</w:t>
         <w:br/>
       </w:r>
       <w:r>
@@ -1902,7 +1901,7 @@
           <w:color w:val="24292E"/>
           <w:sz w:val="17"/>
         </w:rPr>
-        <w:t xml:space="preserve">  ├─► eval（与 expected 对比：Top1/Top3/缺失/注入/降级）</w:t>
+        <w:t xml:space="preserve">  ├─► eval (compare with expected: Top1/Top3/missing/injection/degraded)</w:t>
         <w:br/>
       </w:r>
       <w:r>
@@ -1911,7 +1910,7 @@
           <w:color w:val="24292E"/>
           <w:sz w:val="17"/>
         </w:rPr>
-        <w:t xml:space="preserve">  └─► push（显式配置；报告+证据哈希，可选证据包）</w:t>
+        <w:t xml:space="preserve">  └─► push (explicit config; report + evidence hashes, optional evidence bundle)</w:t>
       </w:r>
     </w:p>
     <w:p>
@@ -1919,7 +1918,7 @@
         <w:pStyle w:val="Heading1"/>
       </w:pPr>
       <w:r>
-        <w:t>6. 命令参考</w:t>
+        <w:t>6. Command Reference</w:t>
       </w:r>
     </w:p>
     <w:tbl>
@@ -1947,7 +1946,7 @@
                 <w:b/>
                 <w:sz w:val="18"/>
               </w:rPr>
-              <w:t>命令</w:t>
+              <w:t>Command</w:t>
             </w:r>
           </w:p>
         </w:tc>
@@ -1963,7 +1962,7 @@
                 <w:b/>
                 <w:sz w:val="18"/>
               </w:rPr>
-              <w:t>用途</w:t>
+              <w:t>Purpose</w:t>
             </w:r>
           </w:p>
         </w:tc>
@@ -1979,7 +1978,7 @@
                 <w:b/>
                 <w:sz w:val="18"/>
               </w:rPr>
-              <w:t>关键 flags</w:t>
+              <w:t>Key flags</w:t>
             </w:r>
           </w:p>
         </w:tc>
@@ -2010,7 +2009,7 @@
                 <w:rFonts w:ascii="Helvetica Neue" w:hAnsi="Helvetica Neue" w:eastAsia="PingFang SC"/>
                 <w:sz w:val="18"/>
               </w:rPr>
-              <w:t>版本/构建信息</w:t>
+              <w:t>Version/build information</w:t>
             </w:r>
           </w:p>
         </w:tc>
@@ -2055,7 +2054,7 @@
                 <w:rFonts w:ascii="Helvetica Neue" w:hAnsi="Helvetica Neue" w:eastAsia="PingFang SC"/>
                 <w:sz w:val="18"/>
               </w:rPr>
-              <w:t>生成最小可跑事故包</w:t>
+              <w:t>Generate a minimal runnable incident bundle</w:t>
             </w:r>
           </w:p>
         </w:tc>
@@ -2100,7 +2099,7 @@
                 <w:rFonts w:ascii="Helvetica Neue" w:hAnsi="Helvetica Neue" w:eastAsia="PingFang SC"/>
                 <w:sz w:val="18"/>
               </w:rPr>
-              <w:t>导入告警/事件/指标/日志</w:t>
+              <w:t>Import alerts/events/metrics/logs</w:t>
             </w:r>
           </w:p>
         </w:tc>
@@ -2122,7 +2121,7 @@
                 <w:rFonts w:ascii="Helvetica Neue" w:hAnsi="Helvetica Neue" w:eastAsia="PingFang SC"/>
                 <w:sz w:val="18"/>
               </w:rPr>
-              <w:t>、</w:t>
+              <w:t xml:space="preserve">, </w:t>
             </w:r>
             <w:r>
               <w:rPr>
@@ -2137,7 +2136,7 @@
                 <w:rFonts w:ascii="Helvetica Neue" w:hAnsi="Helvetica Neue" w:eastAsia="PingFang SC"/>
                 <w:sz w:val="18"/>
               </w:rPr>
-              <w:t>、</w:t>
+              <w:t xml:space="preserve">, </w:t>
             </w:r>
             <w:r>
               <w:rPr>
@@ -2176,7 +2175,7 @@
                 <w:rFonts w:ascii="Helvetica Neue" w:hAnsi="Helvetica Neue" w:eastAsia="PingFang SC"/>
                 <w:sz w:val="18"/>
               </w:rPr>
-              <w:t>schema、时间、脱敏与证据完整性校验</w:t>
+              <w:t>Schema, timestamp, redaction and evidence-integrity checks</w:t>
             </w:r>
           </w:p>
         </w:tc>
@@ -2187,10 +2186,11 @@
           <w:p>
             <w:r>
               <w:rPr>
-                <w:rFonts w:ascii="Helvetica Neue" w:hAnsi="Helvetica Neue" w:eastAsia="PingFang SC"/>
-                <w:sz w:val="18"/>
-              </w:rPr>
-              <w:t>`--redact strict</w:t>
+                <w:rFonts w:ascii="Menlo" w:hAnsi="Menlo" w:eastAsia="PingFang SC"/>
+                <w:color w:val="24292E"/>
+                <w:sz w:val="16"/>
+              </w:rPr>
+              <w:t>--redact strict|standard|off</w:t>
             </w:r>
           </w:p>
         </w:tc>
@@ -2221,7 +2221,7 @@
                 <w:rFonts w:ascii="Helvetica Neue" w:hAnsi="Helvetica Neue" w:eastAsia="PingFang SC"/>
                 <w:sz w:val="18"/>
               </w:rPr>
-              <w:t>规则分析 + 报告</w:t>
+              <w:t>Rule analysis + report</w:t>
             </w:r>
           </w:p>
         </w:tc>
@@ -2243,7 +2243,7 @@
                 <w:rFonts w:ascii="Helvetica Neue" w:hAnsi="Helvetica Neue" w:eastAsia="PingFang SC"/>
                 <w:sz w:val="18"/>
               </w:rPr>
-              <w:t>、</w:t>
+              <w:t xml:space="preserve">, </w:t>
             </w:r>
             <w:r>
               <w:rPr>
@@ -2258,7 +2258,7 @@
                 <w:rFonts w:ascii="Helvetica Neue" w:hAnsi="Helvetica Neue" w:eastAsia="PingFang SC"/>
                 <w:sz w:val="18"/>
               </w:rPr>
-              <w:t>、模型 4 flag、</w:t>
+              <w:t xml:space="preserve">, four model flags, </w:t>
             </w:r>
             <w:r>
               <w:rPr>
@@ -2273,7 +2273,7 @@
                 <w:rFonts w:ascii="Helvetica Neue" w:hAnsi="Helvetica Neue" w:eastAsia="PingFang SC"/>
                 <w:sz w:val="18"/>
               </w:rPr>
-              <w:t>、</w:t>
+              <w:t xml:space="preserve">, </w:t>
             </w:r>
             <w:r>
               <w:rPr>
@@ -2288,7 +2288,7 @@
                 <w:rFonts w:ascii="Helvetica Neue" w:hAnsi="Helvetica Neue" w:eastAsia="PingFang SC"/>
                 <w:sz w:val="18"/>
               </w:rPr>
-              <w:t>、</w:t>
+              <w:t xml:space="preserve">, </w:t>
             </w:r>
             <w:r>
               <w:rPr>
@@ -2303,7 +2303,7 @@
                 <w:rFonts w:ascii="Helvetica Neue" w:hAnsi="Helvetica Neue" w:eastAsia="PingFang SC"/>
                 <w:sz w:val="18"/>
               </w:rPr>
-              <w:t>、</w:t>
+              <w:t xml:space="preserve">, </w:t>
             </w:r>
             <w:r>
               <w:rPr>
@@ -2318,7 +2318,7 @@
                 <w:rFonts w:ascii="Helvetica Neue" w:hAnsi="Helvetica Neue" w:eastAsia="PingFang SC"/>
                 <w:sz w:val="18"/>
               </w:rPr>
-              <w:t>、</w:t>
+              <w:t xml:space="preserve">, </w:t>
             </w:r>
             <w:r>
               <w:rPr>
@@ -2357,7 +2357,7 @@
                 <w:rFonts w:ascii="Helvetica Neue" w:hAnsi="Helvetica Neue" w:eastAsia="PingFang SC"/>
                 <w:sz w:val="18"/>
               </w:rPr>
-              <w:t>重新渲染已有报告（不重新分析）</w:t>
+              <w:t>Re-render an existing report (no re-analysis)</w:t>
             </w:r>
           </w:p>
         </w:tc>
@@ -2379,7 +2379,7 @@
                 <w:rFonts w:ascii="Helvetica Neue" w:hAnsi="Helvetica Neue" w:eastAsia="PingFang SC"/>
                 <w:sz w:val="18"/>
               </w:rPr>
-              <w:t>、</w:t>
+              <w:t xml:space="preserve">, </w:t>
             </w:r>
             <w:r>
               <w:rPr>
@@ -2418,7 +2418,7 @@
                 <w:rFonts w:ascii="Helvetica Neue" w:hAnsi="Helvetica Neue" w:eastAsia="PingFang SC"/>
                 <w:sz w:val="18"/>
               </w:rPr>
-              <w:t>本地评测</w:t>
+              <w:t>Local evaluation</w:t>
             </w:r>
           </w:p>
         </w:tc>
@@ -2440,7 +2440,7 @@
                 <w:rFonts w:ascii="Helvetica Neue" w:hAnsi="Helvetica Neue" w:eastAsia="PingFang SC"/>
                 <w:sz w:val="18"/>
               </w:rPr>
-              <w:t>、</w:t>
+              <w:t xml:space="preserve">, </w:t>
             </w:r>
             <w:r>
               <w:rPr>
@@ -2455,7 +2455,7 @@
                 <w:rFonts w:ascii="Helvetica Neue" w:hAnsi="Helvetica Neue" w:eastAsia="PingFang SC"/>
                 <w:sz w:val="18"/>
               </w:rPr>
-              <w:t>、</w:t>
+              <w:t xml:space="preserve">, </w:t>
             </w:r>
             <w:r>
               <w:rPr>
@@ -2470,7 +2470,7 @@
                 <w:rFonts w:ascii="Helvetica Neue" w:hAnsi="Helvetica Neue" w:eastAsia="PingFang SC"/>
                 <w:sz w:val="18"/>
               </w:rPr>
-              <w:t>、</w:t>
+              <w:t xml:space="preserve">, </w:t>
             </w:r>
             <w:r>
               <w:rPr>
@@ -2485,7 +2485,7 @@
                 <w:rFonts w:ascii="Helvetica Neue" w:hAnsi="Helvetica Neue" w:eastAsia="PingFang SC"/>
                 <w:sz w:val="18"/>
               </w:rPr>
-              <w:t>、</w:t>
+              <w:t xml:space="preserve">, </w:t>
             </w:r>
             <w:r>
               <w:rPr>
@@ -2500,7 +2500,7 @@
                 <w:rFonts w:ascii="Helvetica Neue" w:hAnsi="Helvetica Neue" w:eastAsia="PingFang SC"/>
                 <w:sz w:val="18"/>
               </w:rPr>
-              <w:t>、</w:t>
+              <w:t xml:space="preserve">, </w:t>
             </w:r>
             <w:r>
               <w:rPr>
@@ -2515,7 +2515,7 @@
                 <w:rFonts w:ascii="Helvetica Neue" w:hAnsi="Helvetica Neue" w:eastAsia="PingFang SC"/>
                 <w:sz w:val="18"/>
               </w:rPr>
-              <w:t>、</w:t>
+              <w:t xml:space="preserve">, </w:t>
             </w:r>
             <w:r>
               <w:rPr>
@@ -2530,7 +2530,7 @@
                 <w:rFonts w:ascii="Helvetica Neue" w:hAnsi="Helvetica Neue" w:eastAsia="PingFang SC"/>
                 <w:sz w:val="18"/>
               </w:rPr>
-              <w:t>、模型 flags</w:t>
+              <w:t>, model flags</w:t>
             </w:r>
           </w:p>
         </w:tc>
@@ -2543,10 +2543,11 @@
           <w:p>
             <w:r>
               <w:rPr>
-                <w:rFonts w:ascii="Helvetica Neue" w:hAnsi="Helvetica Neue" w:eastAsia="PingFang SC"/>
-                <w:sz w:val="18"/>
-              </w:rPr>
-              <w:t>`telemetry status</w:t>
+                <w:rFonts w:ascii="Menlo" w:hAnsi="Menlo" w:eastAsia="PingFang SC"/>
+                <w:color w:val="24292E"/>
+                <w:sz w:val="16"/>
+              </w:rPr>
+              <w:t>telemetry status|enable|disable</w:t>
             </w:r>
           </w:p>
         </w:tc>
@@ -2560,7 +2561,7 @@
                 <w:rFonts w:ascii="Helvetica Neue" w:hAnsi="Helvetica Neue" w:eastAsia="PingFang SC"/>
                 <w:sz w:val="18"/>
               </w:rPr>
-              <w:t>enable</w:t>
+              <w:t>Manage opt-in anonymous telemetry</w:t>
             </w:r>
           </w:p>
         </w:tc>
@@ -2574,7 +2575,7 @@
                 <w:rFonts w:ascii="Helvetica Neue" w:hAnsi="Helvetica Neue" w:eastAsia="PingFang SC"/>
                 <w:sz w:val="18"/>
               </w:rPr>
-              <w:t>disable`</w:t>
+              <w:t>—</w:t>
             </w:r>
           </w:p>
         </w:tc>
@@ -2605,7 +2606,7 @@
                 <w:rFonts w:ascii="Helvetica Neue" w:hAnsi="Helvetica Neue" w:eastAsia="PingFang SC"/>
                 <w:sz w:val="18"/>
               </w:rPr>
-              <w:t>推送报告到企业控制平面（显式 opt-in）</w:t>
+              <w:t>Push the report to an enterprise control plane (explicit opt-in)</w:t>
             </w:r>
           </w:p>
         </w:tc>
@@ -2627,7 +2628,7 @@
                 <w:rFonts w:ascii="Helvetica Neue" w:hAnsi="Helvetica Neue" w:eastAsia="PingFang SC"/>
                 <w:sz w:val="18"/>
               </w:rPr>
-              <w:t>、</w:t>
+              <w:t xml:space="preserve">, </w:t>
             </w:r>
             <w:r>
               <w:rPr>
@@ -2642,7 +2643,7 @@
                 <w:rFonts w:ascii="Helvetica Neue" w:hAnsi="Helvetica Neue" w:eastAsia="PingFang SC"/>
                 <w:sz w:val="18"/>
               </w:rPr>
-              <w:t>、</w:t>
+              <w:t xml:space="preserve">, </w:t>
             </w:r>
             <w:r>
               <w:rPr>
@@ -2657,7 +2658,7 @@
                 <w:rFonts w:ascii="Helvetica Neue" w:hAnsi="Helvetica Neue" w:eastAsia="PingFang SC"/>
                 <w:sz w:val="18"/>
               </w:rPr>
-              <w:t>、</w:t>
+              <w:t xml:space="preserve">, </w:t>
             </w:r>
             <w:r>
               <w:rPr>
@@ -2672,7 +2673,7 @@
                 <w:rFonts w:ascii="Helvetica Neue" w:hAnsi="Helvetica Neue" w:eastAsia="PingFang SC"/>
                 <w:sz w:val="18"/>
               </w:rPr>
-              <w:t>、</w:t>
+              <w:t xml:space="preserve">, </w:t>
             </w:r>
             <w:r>
               <w:rPr>
@@ -2687,7 +2688,7 @@
                 <w:rFonts w:ascii="Helvetica Neue" w:hAnsi="Helvetica Neue" w:eastAsia="PingFang SC"/>
                 <w:sz w:val="18"/>
               </w:rPr>
-              <w:t>、</w:t>
+              <w:t xml:space="preserve">, </w:t>
             </w:r>
             <w:r>
               <w:rPr>
@@ -2707,7 +2708,7 @@
         <w:pStyle w:val="Heading2"/>
       </w:pPr>
       <w:r>
-        <w:t>退出码</w:t>
+        <w:t>Exit Codes</w:t>
       </w:r>
     </w:p>
     <w:tbl>
@@ -2734,7 +2735,7 @@
                 <w:b/>
                 <w:sz w:val="18"/>
               </w:rPr>
-              <w:t>码</w:t>
+              <w:t>Code</w:t>
             </w:r>
           </w:p>
         </w:tc>
@@ -2750,7 +2751,7 @@
                 <w:b/>
                 <w:sz w:val="18"/>
               </w:rPr>
-              <w:t>含义</w:t>
+              <w:t>Meaning</w:t>
             </w:r>
           </w:p>
         </w:tc>
@@ -2780,7 +2781,7 @@
                 <w:rFonts w:ascii="Helvetica Neue" w:hAnsi="Helvetica Neue" w:eastAsia="PingFang SC"/>
                 <w:sz w:val="18"/>
               </w:rPr>
-              <w:t>成功</w:t>
+              <w:t>Success</w:t>
             </w:r>
           </w:p>
         </w:tc>
@@ -2810,7 +2811,7 @@
                 <w:rFonts w:ascii="Helvetica Neue" w:hAnsi="Helvetica Neue" w:eastAsia="PingFang SC"/>
                 <w:sz w:val="18"/>
               </w:rPr>
-              <w:t xml:space="preserve">输入/配置错误（含 </w:t>
+              <w:t xml:space="preserve">Input/configuration error (including </w:t>
             </w:r>
             <w:r>
               <w:rPr>
@@ -2825,7 +2826,7 @@
                 <w:rFonts w:ascii="Helvetica Neue" w:hAnsi="Helvetica Neue" w:eastAsia="PingFang SC"/>
                 <w:sz w:val="18"/>
               </w:rPr>
-              <w:t xml:space="preserve"> 与 </w:t>
+              <w:t xml:space="preserve"> vs </w:t>
             </w:r>
             <w:r>
               <w:rPr>
@@ -2840,7 +2841,7 @@
                 <w:rFonts w:ascii="Helvetica Neue" w:hAnsi="Helvetica Neue" w:eastAsia="PingFang SC"/>
                 <w:sz w:val="18"/>
               </w:rPr>
-              <w:t xml:space="preserve"> 冲突、push 配置/鉴权失败）</w:t>
+              <w:t xml:space="preserve"> conflict, push configuration/authentication failure)</w:t>
             </w:r>
           </w:p>
         </w:tc>
@@ -2870,7 +2871,7 @@
                 <w:rFonts w:ascii="Helvetica Neue" w:hAnsi="Helvetica Neue" w:eastAsia="PingFang SC"/>
                 <w:sz w:val="18"/>
               </w:rPr>
-              <w:t>证据不足（</w:t>
+              <w:t>Insufficient evidence (</w:t>
             </w:r>
             <w:r>
               <w:rPr>
@@ -2885,7 +2886,7 @@
                 <w:rFonts w:ascii="Helvetica Neue" w:hAnsi="Helvetica Neue" w:eastAsia="PingFang SC"/>
                 <w:sz w:val="18"/>
               </w:rPr>
-              <w:t>）或评测存在不通过用例</w:t>
+              <w:t>) or evaluation has failing cases</w:t>
             </w:r>
           </w:p>
         </w:tc>
@@ -2915,7 +2916,7 @@
                 <w:rFonts w:ascii="Helvetica Neue" w:hAnsi="Helvetica Neue" w:eastAsia="PingFang SC"/>
                 <w:sz w:val="18"/>
               </w:rPr>
-              <w:t>模型/网络失败已降级（报告已写出并标注 degraded）</w:t>
+              <w:t>Model/network failure, already degraded (report written with degraded=true)</w:t>
             </w:r>
           </w:p>
         </w:tc>
@@ -2945,7 +2946,7 @@
                 <w:rFonts w:ascii="Helvetica Neue" w:hAnsi="Helvetica Neue" w:eastAsia="PingFang SC"/>
                 <w:sz w:val="18"/>
               </w:rPr>
-              <w:t>安全校验失败（发现敏感内容/越权数据）</w:t>
+              <w:t>Security check failed (sensitive content or unauthorized data detected)</w:t>
             </w:r>
           </w:p>
         </w:tc>
@@ -2957,7 +2958,7 @@
         <w:pStyle w:val="Heading1"/>
       </w:pPr>
       <w:r>
-        <w:t>7. 数据契约</w:t>
+        <w:t>7. Data Contracts</w:t>
       </w:r>
     </w:p>
     <w:p>
@@ -2965,10 +2966,17 @@
         <w:pStyle w:val="Heading2"/>
       </w:pPr>
       <w:r>
-        <w:t>7.1 事故包（输入）</w:t>
+        <w:t>7.1 Incident Bundle (input)</w:t>
       </w:r>
     </w:p>
     <w:p>
+      <w:r>
+        <w:rPr>
+          <w:rFonts w:ascii="Helvetica Neue" w:hAnsi="Helvetica Neue" w:eastAsia="PingFang SC"/>
+          <w:sz w:val="21"/>
+        </w:rPr>
+        <w:t xml:space="preserve">Required </w:t>
+      </w:r>
       <w:r>
         <w:rPr>
           <w:rFonts w:ascii="Menlo" w:hAnsi="Menlo" w:eastAsia="PingFang SC"/>
@@ -2982,7 +2990,22 @@
           <w:rFonts w:ascii="Helvetica Neue" w:hAnsi="Helvetica Neue" w:eastAsia="PingFang SC"/>
           <w:sz w:val="21"/>
         </w:rPr>
-        <w:t xml:space="preserve"> 必填字段：`id, alertname, severity(critical|warning|info), cluster, namespace,</w:t>
+        <w:t xml:space="preserve"> fields: </w:t>
+      </w:r>
+      <w:r>
+        <w:rPr>
+          <w:rFonts w:ascii="Menlo" w:hAnsi="Menlo" w:eastAsia="PingFang SC"/>
+          <w:color w:val="24292E"/>
+          <w:sz w:val="19"/>
+        </w:rPr>
+        <w:t>id, alertname, severity(critical|warning|info), cluster, namespace, workload, observed_at, collected_at, source</w:t>
+      </w:r>
+      <w:r>
+        <w:rPr>
+          <w:rFonts w:ascii="Helvetica Neue" w:hAnsi="Helvetica Neue" w:eastAsia="PingFang SC"/>
+          <w:sz w:val="21"/>
+        </w:rPr>
+        <w:t xml:space="preserve"> (RFC3339 timestamps).</w:t>
       </w:r>
     </w:p>
     <w:p>
@@ -2991,16 +3014,7 @@
           <w:rFonts w:ascii="Helvetica Neue" w:hAnsi="Helvetica Neue" w:eastAsia="PingFang SC"/>
           <w:sz w:val="21"/>
         </w:rPr>
-        <w:t>workload, observed_at, collected_at, source`（RFC3339 时间）。</w:t>
-      </w:r>
-    </w:p>
-    <w:p>
-      <w:r>
-        <w:rPr>
-          <w:rFonts w:ascii="Helvetica Neue" w:hAnsi="Helvetica Neue" w:eastAsia="PingFang SC"/>
-          <w:sz w:val="21"/>
-        </w:rPr>
-        <w:t>证据文件（可选，按需）：</w:t>
+        <w:t xml:space="preserve">Optional evidence files (as needed): </w:t>
       </w:r>
       <w:r>
         <w:rPr>
@@ -3015,7 +3029,7 @@
           <w:rFonts w:ascii="Helvetica Neue" w:hAnsi="Helvetica Neue" w:eastAsia="PingFang SC"/>
           <w:sz w:val="21"/>
         </w:rPr>
-        <w:t>、</w:t>
+        <w:t xml:space="preserve">, </w:t>
       </w:r>
       <w:r>
         <w:rPr>
@@ -3030,7 +3044,7 @@
           <w:rFonts w:ascii="Helvetica Neue" w:hAnsi="Helvetica Neue" w:eastAsia="PingFang SC"/>
           <w:sz w:val="21"/>
         </w:rPr>
-        <w:t>、</w:t>
+        <w:t xml:space="preserve">, </w:t>
       </w:r>
       <w:r>
         <w:rPr>
@@ -3045,10 +3059,8 @@
           <w:rFonts w:ascii="Helvetica Neue" w:hAnsi="Helvetica Neue" w:eastAsia="PingFang SC"/>
           <w:sz w:val="21"/>
         </w:rPr>
-        <w:t>、</w:t>
+        <w:t xml:space="preserve">, </w:t>
       </w:r>
-    </w:p>
-    <w:p>
       <w:r>
         <w:rPr>
           <w:rFonts w:ascii="Menlo" w:hAnsi="Menlo" w:eastAsia="PingFang SC"/>
@@ -3062,7 +3074,7 @@
           <w:rFonts w:ascii="Helvetica Neue" w:hAnsi="Helvetica Neue" w:eastAsia="PingFang SC"/>
           <w:sz w:val="21"/>
         </w:rPr>
-        <w:t>、</w:t>
+        <w:t xml:space="preserve">, </w:t>
       </w:r>
       <w:r>
         <w:rPr>
@@ -3077,7 +3089,7 @@
           <w:rFonts w:ascii="Helvetica Neue" w:hAnsi="Helvetica Neue" w:eastAsia="PingFang SC"/>
           <w:sz w:val="21"/>
         </w:rPr>
-        <w:t>、</w:t>
+        <w:t xml:space="preserve">, </w:t>
       </w:r>
       <w:r>
         <w:rPr>
@@ -3092,10 +3104,8 @@
           <w:rFonts w:ascii="Helvetica Neue" w:hAnsi="Helvetica Neue" w:eastAsia="PingFang SC"/>
           <w:sz w:val="21"/>
         </w:rPr>
-        <w:t>、</w:t>
+        <w:t xml:space="preserve">, </w:t>
       </w:r>
-    </w:p>
-    <w:p>
       <w:r>
         <w:rPr>
           <w:rFonts w:ascii="Menlo" w:hAnsi="Menlo" w:eastAsia="PingFang SC"/>
@@ -3109,7 +3119,7 @@
           <w:rFonts w:ascii="Helvetica Neue" w:hAnsi="Helvetica Neue" w:eastAsia="PingFang SC"/>
           <w:sz w:val="21"/>
         </w:rPr>
-        <w:t>、</w:t>
+        <w:t xml:space="preserve">, </w:t>
       </w:r>
       <w:r>
         <w:rPr>
@@ -3124,7 +3134,7 @@
           <w:rFonts w:ascii="Helvetica Neue" w:hAnsi="Helvetica Neue" w:eastAsia="PingFang SC"/>
           <w:sz w:val="21"/>
         </w:rPr>
-        <w:t>、</w:t>
+        <w:t xml:space="preserve">, </w:t>
       </w:r>
       <w:r>
         <w:rPr>
@@ -3139,7 +3149,7 @@
           <w:rFonts w:ascii="Helvetica Neue" w:hAnsi="Helvetica Neue" w:eastAsia="PingFang SC"/>
           <w:sz w:val="21"/>
         </w:rPr>
-        <w:t>。</w:t>
+        <w:t>.</w:t>
       </w:r>
     </w:p>
     <w:p>
@@ -3147,7 +3157,7 @@
         <w:pStyle w:val="Heading2"/>
       </w:pPr>
       <w:r>
-        <w:t>7.2 报告（输出）</w:t>
+        <w:t>7.2 Report (output)</w:t>
       </w:r>
     </w:p>
     <w:p>
@@ -3156,16 +3166,22 @@
           <w:rFonts w:ascii="Helvetica Neue" w:hAnsi="Helvetica Neue" w:eastAsia="PingFang SC"/>
           <w:sz w:val="21"/>
         </w:rPr>
-        <w:t>顶层字段：`schema_version("1.0"), incident, generated_at, mode(offline|model), degraded, summary,</w:t>
+        <w:t xml:space="preserve">Top-level fields: </w:t>
       </w:r>
-    </w:p>
-    <w:p>
+      <w:r>
+        <w:rPr>
+          <w:rFonts w:ascii="Menlo" w:hAnsi="Menlo" w:eastAsia="PingFang SC"/>
+          <w:color w:val="24292E"/>
+          <w:sz w:val="19"/>
+        </w:rPr>
+        <w:t>schema_version("1.0"), incident, generated_at, mode(offline|model), degraded, summary, evidence[], hypotheses[≤3], missing_data[], recommended_checks[], suggested_fix, limitations[], versions{}</w:t>
+      </w:r>
       <w:r>
         <w:rPr>
           <w:rFonts w:ascii="Helvetica Neue" w:hAnsi="Helvetica Neue" w:eastAsia="PingFang SC"/>
           <w:sz w:val="21"/>
         </w:rPr>
-        <w:t>evidence[], hypotheses[≤3], missing_data[], recommended_checks[], suggested_fix, limitations[], versions{}`。</w:t>
+        <w:t>.</w:t>
       </w:r>
     </w:p>
     <w:p>
@@ -3177,16 +3193,22 @@
           <w:rFonts w:ascii="Helvetica Neue" w:hAnsi="Helvetica Neue" w:eastAsia="PingFang SC"/>
           <w:sz w:val="21"/>
         </w:rPr>
-        <w:t>证据字段：`id, source, observed_at, collected_at, summary, content_ref, query?, redaction?,</w:t>
+        <w:t xml:space="preserve">Evidence fields: </w:t>
       </w:r>
-    </w:p>
-    <w:p>
+      <w:r>
+        <w:rPr>
+          <w:rFonts w:ascii="Menlo" w:hAnsi="Menlo" w:eastAsia="PingFang SC"/>
+          <w:color w:val="24292E"/>
+          <w:sz w:val="19"/>
+        </w:rPr>
+        <w:t>id, source, observed_at, collected_at, summary, content_ref, query?, redaction?, sha256, stale, skew_seconds?</w:t>
+      </w:r>
       <w:r>
         <w:rPr>
           <w:rFonts w:ascii="Helvetica Neue" w:hAnsi="Helvetica Neue" w:eastAsia="PingFang SC"/>
           <w:sz w:val="21"/>
         </w:rPr>
-        <w:t>sha256, stale, skew_seconds?`；</w:t>
+        <w:t>;</w:t>
       </w:r>
     </w:p>
     <w:p>
@@ -3206,7 +3228,7 @@
           <w:rFonts w:ascii="Helvetica Neue" w:hAnsi="Helvetica Neue" w:eastAsia="PingFang SC"/>
           <w:sz w:val="21"/>
         </w:rPr>
-        <w:t xml:space="preserve"> 约定：整文件 </w:t>
+        <w:t xml:space="preserve"> conventions: whole file </w:t>
       </w:r>
       <w:r>
         <w:rPr>
@@ -3221,7 +3243,7 @@
           <w:rFonts w:ascii="Helvetica Neue" w:hAnsi="Helvetica Neue" w:eastAsia="PingFang SC"/>
           <w:sz w:val="21"/>
         </w:rPr>
-        <w:t xml:space="preserve">、JSON 条目 </w:t>
+        <w:t xml:space="preserve">, JSON entry </w:t>
       </w:r>
       <w:r>
         <w:rPr>
@@ -3236,10 +3258,8 @@
           <w:rFonts w:ascii="Helvetica Neue" w:hAnsi="Helvetica Neue" w:eastAsia="PingFang SC"/>
           <w:sz w:val="21"/>
         </w:rPr>
-        <w:t>、日志行</w:t>
+        <w:t xml:space="preserve">, log line </w:t>
       </w:r>
-    </w:p>
-    <w:p>
       <w:r>
         <w:rPr>
           <w:rFonts w:ascii="Menlo" w:hAnsi="Menlo" w:eastAsia="PingFang SC"/>
@@ -3253,7 +3273,7 @@
           <w:rFonts w:ascii="Helvetica Neue" w:hAnsi="Helvetica Neue" w:eastAsia="PingFang SC"/>
           <w:sz w:val="21"/>
         </w:rPr>
-        <w:t>；</w:t>
+        <w:t>;</w:t>
       </w:r>
     </w:p>
     <w:p>
@@ -3265,7 +3285,7 @@
           <w:rFonts w:ascii="Helvetica Neue" w:hAnsi="Helvetica Neue" w:eastAsia="PingFang SC"/>
           <w:sz w:val="21"/>
         </w:rPr>
-        <w:t>每条结论必须引用存在证据；反证与支持证据不得同 id；建议均为只读、不生成可执行脚本。</w:t>
+        <w:t>Every conclusion must cite existing evidence; counter-evidence and supporting evidence must not share the same id; all suggestions are read-only and never generate executable scripts.</w:t>
       </w:r>
     </w:p>
     <w:p>
@@ -3273,7 +3293,7 @@
         <w:pStyle w:val="Heading2"/>
       </w:pPr>
       <w:r>
-        <w:t>7.3 版本与兼容</w:t>
+        <w:t>7.3 Versioning and Compatibility</w:t>
       </w:r>
     </w:p>
     <w:p>
@@ -3285,7 +3305,7 @@
           <w:rFonts w:ascii="Helvetica Neue" w:hAnsi="Helvetica Neue" w:eastAsia="PingFang SC"/>
           <w:sz w:val="21"/>
         </w:rPr>
-        <w:t xml:space="preserve">报告 </w:t>
+        <w:t xml:space="preserve">The report </w:t>
       </w:r>
       <w:r>
         <w:rPr>
@@ -3300,7 +3320,7 @@
           <w:rFonts w:ascii="Helvetica Neue" w:hAnsi="Helvetica Neue" w:eastAsia="PingFang SC"/>
           <w:sz w:val="21"/>
         </w:rPr>
-        <w:t xml:space="preserve"> 固定 </w:t>
+        <w:t xml:space="preserve"> is fixed at </w:t>
       </w:r>
       <w:r>
         <w:rPr>
@@ -3315,7 +3335,7 @@
           <w:rFonts w:ascii="Helvetica Neue" w:hAnsi="Helvetica Neue" w:eastAsia="PingFang SC"/>
           <w:sz w:val="21"/>
         </w:rPr>
-        <w:t>；v0.x 允许破坏性变更但需 CHANGELOG + 迁移说明；</w:t>
+        <w:t>; v0.x allows breaking changes but requires a CHANGELOG + migration notes;</w:t>
       </w:r>
     </w:p>
     <w:p>
@@ -3327,14 +3347,14 @@
           <w:rFonts w:ascii="Helvetica Neue" w:hAnsi="Helvetica Neue" w:eastAsia="PingFang SC"/>
           <w:sz w:val="21"/>
         </w:rPr>
-        <w:t xml:space="preserve">v1.0 起至少兼容一个大版本；新增可选字段不破坏旧消费者（策略见 </w:t>
+        <w:t xml:space="preserve">Starting with v1.0, at least one major version is supported; new optional fields do not break old consumers (see the </w:t>
       </w:r>
       <w:r>
         <w:rPr>
           <w:rFonts w:ascii="Helvetica Neue" w:hAnsi="Helvetica Neue" w:eastAsia="PingFang SC"/>
           <w:sz w:val="21"/>
         </w:rPr>
-        <w:t>schema 契约</w:t>
+        <w:t>schema contract (Chinese)</w:t>
       </w:r>
       <w:r>
         <w:rPr>
@@ -3349,16 +3369,14 @@
           <w:rFonts w:ascii="Helvetica Neue" w:hAnsi="Helvetica Neue" w:eastAsia="PingFang SC"/>
           <w:sz w:val="21"/>
         </w:rPr>
-        <w:t xml:space="preserve"> 与</w:t>
+        <w:t xml:space="preserve"> and </w:t>
       </w:r>
-    </w:p>
-    <w:p>
       <w:r>
         <w:rPr>
           <w:rFonts w:ascii="Helvetica Neue" w:hAnsi="Helvetica Neue" w:eastAsia="PingFang SC"/>
           <w:sz w:val="21"/>
         </w:rPr>
-        <w:t>ADR-007</w:t>
+        <w:t>ADR-007 (Chinese)</w:t>
       </w:r>
       <w:r>
         <w:rPr>
@@ -3373,7 +3391,7 @@
           <w:rFonts w:ascii="Helvetica Neue" w:hAnsi="Helvetica Neue" w:eastAsia="PingFang SC"/>
           <w:sz w:val="21"/>
         </w:rPr>
-        <w:t>）；</w:t>
+        <w:t>);</w:t>
       </w:r>
     </w:p>
     <w:p>
@@ -3385,7 +3403,7 @@
           <w:rFonts w:ascii="Helvetica Neue" w:hAnsi="Helvetica Neue" w:eastAsia="PingFang SC"/>
           <w:sz w:val="21"/>
         </w:rPr>
-        <w:t xml:space="preserve">兼容性由 </w:t>
+        <w:t xml:space="preserve">Compatibility is guarded by the </w:t>
       </w:r>
       <w:r>
         <w:rPr>
@@ -3400,7 +3418,7 @@
           <w:rFonts w:ascii="Helvetica Neue" w:hAnsi="Helvetica Neue" w:eastAsia="PingFang SC"/>
           <w:sz w:val="21"/>
         </w:rPr>
-        <w:t xml:space="preserve"> 基线测试守护（</w:t>
+        <w:t xml:space="preserve"> baseline tests (</w:t>
       </w:r>
       <w:r>
         <w:rPr>
@@ -3415,7 +3433,7 @@
           <w:rFonts w:ascii="Helvetica Neue" w:hAnsi="Helvetica Neue" w:eastAsia="PingFang SC"/>
           <w:sz w:val="21"/>
         </w:rPr>
-        <w:t xml:space="preserve"> 显式变更 + review）。</w:t>
+        <w:t xml:space="preserve"> for explicit changes + review).</w:t>
       </w:r>
     </w:p>
     <w:p>
@@ -3423,7 +3441,7 @@
         <w:pStyle w:val="Heading1"/>
       </w:pPr>
       <w:r>
-        <w:t>8. 分析引擎</w:t>
+        <w:t>8. Analysis Engine</w:t>
       </w:r>
     </w:p>
     <w:p>
@@ -3431,7 +3449,7 @@
         <w:pStyle w:val="Heading2"/>
       </w:pPr>
       <w:r>
-        <w:t>8.1 五类故障规则（确定性，rule-v0.2）</w:t>
+        <w:t>8.1 Five Failure-Class Rules (deterministic, rule-v0.2)</w:t>
       </w:r>
     </w:p>
     <w:tbl>
@@ -3459,7 +3477,7 @@
                 <w:b/>
                 <w:sz w:val="18"/>
               </w:rPr>
-              <w:t>故障类</w:t>
+              <w:t>Failure class</w:t>
             </w:r>
           </w:p>
         </w:tc>
@@ -3475,7 +3493,7 @@
                 <w:b/>
                 <w:sz w:val="18"/>
               </w:rPr>
-              <w:t>典型信号</w:t>
+              <w:t>Typical signals</w:t>
             </w:r>
           </w:p>
         </w:tc>
@@ -3491,7 +3509,7 @@
                 <w:b/>
                 <w:sz w:val="18"/>
               </w:rPr>
-              <w:t>默认置信</w:t>
+              <w:t>Default confidence</w:t>
             </w:r>
           </w:p>
         </w:tc>
@@ -3529,7 +3547,7 @@
                 <w:rFonts w:ascii="Helvetica Neue" w:hAnsi="Helvetica Neue" w:eastAsia="PingFang SC"/>
                 <w:sz w:val="18"/>
               </w:rPr>
-              <w:t>、</w:t>
+              <w:t xml:space="preserve">, </w:t>
             </w:r>
             <w:r>
               <w:rPr>
@@ -3544,7 +3562,7 @@
                 <w:rFonts w:ascii="Helvetica Neue" w:hAnsi="Helvetica Neue" w:eastAsia="PingFang SC"/>
                 <w:sz w:val="18"/>
               </w:rPr>
-              <w:t>、内存 limit 相关</w:t>
+              <w:t>, memory-limit related</w:t>
             </w:r>
           </w:p>
         </w:tc>
@@ -3558,7 +3576,7 @@
                 <w:rFonts w:ascii="Helvetica Neue" w:hAnsi="Helvetica Neue" w:eastAsia="PingFang SC"/>
                 <w:sz w:val="18"/>
               </w:rPr>
-              <w:t>high（≥2 独立来源且新鲜）</w:t>
+              <w:t>high (≥2 independent sources and fresh)</w:t>
             </w:r>
           </w:p>
         </w:tc>
@@ -3596,7 +3614,7 @@
                 <w:rFonts w:ascii="Helvetica Neue" w:hAnsi="Helvetica Neue" w:eastAsia="PingFang SC"/>
                 <w:sz w:val="18"/>
               </w:rPr>
-              <w:t>、</w:t>
+              <w:t xml:space="preserve">, </w:t>
             </w:r>
             <w:r>
               <w:rPr>
@@ -3656,7 +3674,7 @@
                 <w:rFonts w:ascii="Helvetica Neue" w:hAnsi="Helvetica Neue" w:eastAsia="PingFang SC"/>
                 <w:sz w:val="18"/>
               </w:rPr>
-              <w:t>、</w:t>
+              <w:t xml:space="preserve">, </w:t>
             </w:r>
             <w:r>
               <w:rPr>
@@ -3671,7 +3689,7 @@
                 <w:rFonts w:ascii="Helvetica Neue" w:hAnsi="Helvetica Neue" w:eastAsia="PingFang SC"/>
                 <w:sz w:val="18"/>
               </w:rPr>
-              <w:t>、</w:t>
+              <w:t xml:space="preserve">, </w:t>
             </w:r>
             <w:r>
               <w:rPr>
@@ -3731,7 +3749,7 @@
                 <w:rFonts w:ascii="Helvetica Neue" w:hAnsi="Helvetica Neue" w:eastAsia="PingFang SC"/>
                 <w:sz w:val="18"/>
               </w:rPr>
-              <w:t>、资源不足/亲和性</w:t>
+              <w:t>, insufficient resources/affinity</w:t>
             </w:r>
           </w:p>
         </w:tc>
@@ -3761,7 +3779,7 @@
                 <w:rFonts w:ascii="Helvetica Neue" w:hAnsi="Helvetica Neue" w:eastAsia="PingFang SC"/>
                 <w:sz w:val="18"/>
               </w:rPr>
-              <w:t>发布回归</w:t>
+              <w:t>Release regression</w:t>
             </w:r>
           </w:p>
         </w:tc>
@@ -3783,7 +3801,7 @@
                 <w:rFonts w:ascii="Helvetica Neue" w:hAnsi="Helvetica Neue" w:eastAsia="PingFang SC"/>
                 <w:sz w:val="18"/>
               </w:rPr>
-              <w:t xml:space="preserve"> 记录 + ReplicaSet/镜像差异</w:t>
+              <w:t xml:space="preserve"> records + ReplicaSet/image diff</w:t>
             </w:r>
           </w:p>
         </w:tc>
@@ -3810,16 +3828,7 @@
           <w:rFonts w:ascii="Helvetica Neue" w:hAnsi="Helvetica Neue" w:eastAsia="PingFang SC"/>
           <w:sz w:val="21"/>
         </w:rPr>
-        <w:t>每个假设带：证据引用、反证（如镜像曾成功拉取、探针失败、发布早于故障窗口）、置信分层</w:t>
-      </w:r>
-    </w:p>
-    <w:p>
-      <w:r>
-        <w:rPr>
-          <w:rFonts w:ascii="Helvetica Neue" w:hAnsi="Helvetica Neue" w:eastAsia="PingFang SC"/>
-          <w:sz w:val="21"/>
-        </w:rPr>
-        <w:t>（</w:t>
+        <w:t>Each hypothesis carries: evidence citations, counter-evidence (for example the image was pulled successfully earlier, probe failures, a rollout earlier than the incident window), confidence tiers (</w:t>
       </w:r>
       <w:r>
         <w:rPr>
@@ -3834,7 +3843,7 @@
           <w:rFonts w:ascii="Helvetica Neue" w:hAnsi="Helvetica Neue" w:eastAsia="PingFang SC"/>
           <w:sz w:val="21"/>
         </w:rPr>
-        <w:t>，stale/反证会降级）、缺失证据与下一步、只读修复建议。</w:t>
+        <w:t>; stale evidence or counter-evidence lowers it), missing evidence and next steps, and read-only remediation suggestions.</w:t>
       </w:r>
     </w:p>
     <w:p>
@@ -3842,7 +3851,7 @@
         <w:pStyle w:val="Heading2"/>
       </w:pPr>
       <w:r>
-        <w:t>8.2 可选模型（默认关闭）</w:t>
+        <w:t>8.2 Optional Model (disabled by default)</w:t>
       </w:r>
     </w:p>
     <w:p>
@@ -3854,7 +3863,7 @@
           <w:rFonts w:ascii="Helvetica Neue" w:hAnsi="Helvetica Neue" w:eastAsia="PingFang SC"/>
           <w:sz w:val="21"/>
         </w:rPr>
-        <w:t>provider：OpenAI-compatible（</w:t>
+        <w:t>providers: OpenAI-compatible (</w:t>
       </w:r>
       <w:r>
         <w:rPr>
@@ -3869,7 +3878,7 @@
           <w:rFonts w:ascii="Helvetica Neue" w:hAnsi="Helvetica Neue" w:eastAsia="PingFang SC"/>
           <w:sz w:val="21"/>
         </w:rPr>
-        <w:t>）/ Ollama（</w:t>
+        <w:t>) / Ollama (</w:t>
       </w:r>
       <w:r>
         <w:rPr>
@@ -3884,16 +3893,7 @@
           <w:rFonts w:ascii="Helvetica Neue" w:hAnsi="Helvetica Neue" w:eastAsia="PingFang SC"/>
           <w:sz w:val="21"/>
         </w:rPr>
-        <w:t>）；</w:t>
-      </w:r>
-    </w:p>
-    <w:p>
-      <w:r>
-        <w:rPr>
-          <w:rFonts w:ascii="Helvetica Neue" w:hAnsi="Helvetica Neue" w:eastAsia="PingFang SC"/>
-          <w:sz w:val="21"/>
-        </w:rPr>
-        <w:t>温度 0、仅 JSON；</w:t>
+        <w:t>); temperature 0, JSON only;</w:t>
       </w:r>
     </w:p>
     <w:p>
@@ -3905,7 +3905,7 @@
           <w:rFonts w:ascii="Helvetica Neue" w:hAnsi="Helvetica Neue" w:eastAsia="PingFang SC"/>
           <w:sz w:val="21"/>
         </w:rPr>
-        <w:t>只访问配置端点、禁用重定向；证据视为不可信数据；模型输出经 schema + 引用闭合 + 文本中和；</w:t>
+        <w:t>only the configured endpoint is contacted; redirects are disabled; evidence is treated as untrusted data; model output goes through schema validation, citation closure and text neutralization;</w:t>
       </w:r>
     </w:p>
     <w:p>
@@ -3917,7 +3917,7 @@
           <w:rFonts w:ascii="Helvetica Neue" w:hAnsi="Helvetica Neue" w:eastAsia="PingFang SC"/>
           <w:sz w:val="21"/>
         </w:rPr>
-        <w:t xml:space="preserve">预算/超时/轮次受控（默认 $1 / 60s / 3 轮）；任何运行时失败保留离线报告并标 </w:t>
+        <w:t xml:space="preserve">budget/timeout/rounds are controlled (defaults $1 / 60s / 3 rounds); any runtime failure keeps the offline report and marks it </w:t>
       </w:r>
       <w:r>
         <w:rPr>
@@ -3932,23 +3932,14 @@
           <w:rFonts w:ascii="Helvetica Neue" w:hAnsi="Helvetica Neue" w:eastAsia="PingFang SC"/>
           <w:sz w:val="21"/>
         </w:rPr>
-        <w:t>，</w:t>
-      </w:r>
-    </w:p>
-    <w:p>
-      <w:r>
-        <w:rPr>
-          <w:rFonts w:ascii="Helvetica Neue" w:hAnsi="Helvetica Neue" w:eastAsia="PingFang SC"/>
-          <w:sz w:val="21"/>
-        </w:rPr>
-        <w:t xml:space="preserve">退出码 3；配置错误退出码 1。详见 </w:t>
+        <w:t xml:space="preserve">, exit code 3; configuration errors exit code 1. See </w:t>
       </w:r>
       <w:r>
         <w:rPr>
           <w:rFonts w:ascii="Helvetica Neue" w:hAnsi="Helvetica Neue" w:eastAsia="PingFang SC"/>
           <w:sz w:val="21"/>
         </w:rPr>
-        <w:t>模型模式</w:t>
+        <w:t>Model mode (Chinese)</w:t>
       </w:r>
       <w:r>
         <w:rPr>
@@ -3963,7 +3954,7 @@
           <w:rFonts w:ascii="Helvetica Neue" w:hAnsi="Helvetica Neue" w:eastAsia="PingFang SC"/>
           <w:sz w:val="21"/>
         </w:rPr>
-        <w:t>。</w:t>
+        <w:t>.</w:t>
       </w:r>
     </w:p>
     <w:p>
@@ -3971,7 +3962,7 @@
         <w:pStyle w:val="Heading1"/>
       </w:pPr>
       <w:r>
-        <w:t>9. 安全与隐私</w:t>
+        <w:t>9. Security and Privacy</w:t>
       </w:r>
     </w:p>
     <w:p>
@@ -3984,14 +3975,14 @@
           <w:b/>
           <w:sz w:val="21"/>
         </w:rPr>
-        <w:t>默认离线</w:t>
+        <w:t>Offline by default</w:t>
       </w:r>
       <w:r>
         <w:rPr>
           <w:rFonts w:ascii="Helvetica Neue" w:hAnsi="Helvetica Neue" w:eastAsia="PingFang SC"/>
           <w:sz w:val="21"/>
         </w:rPr>
-        <w:t>：不访问集群、不访问网络；模型、push、遥测均显式 opt-in；</w:t>
+        <w:t>: no cluster or network access; model, push and telemetry are all explicit opt-in;</w:t>
       </w:r>
     </w:p>
     <w:p>
@@ -4004,14 +3995,14 @@
           <w:b/>
           <w:sz w:val="21"/>
         </w:rPr>
-        <w:t>只读</w:t>
+        <w:t>Read-only</w:t>
       </w:r>
       <w:r>
         <w:rPr>
           <w:rFonts w:ascii="Helvetica Neue" w:hAnsi="Helvetica Neue" w:eastAsia="PingFang SC"/>
           <w:sz w:val="21"/>
         </w:rPr>
-        <w:t xml:space="preserve">：不读 Secret、不解析 kubeconfig、不执行 </w:t>
+        <w:t xml:space="preserve">: never reads Secrets, never parses kubeconfig, never executes </w:t>
       </w:r>
       <w:r>
         <w:rPr>
@@ -4026,7 +4017,7 @@
           <w:rFonts w:ascii="Helvetica Neue" w:hAnsi="Helvetica Neue" w:eastAsia="PingFang SC"/>
           <w:sz w:val="21"/>
         </w:rPr>
-        <w:t>；修复建议均只读；</w:t>
+        <w:t>; all remediation suggestions are read-only;</w:t>
       </w:r>
     </w:p>
     <w:p>
@@ -4039,14 +4030,14 @@
           <w:b/>
           <w:sz w:val="21"/>
         </w:rPr>
-        <w:t>输入安全</w:t>
+        <w:t>Input safety</w:t>
       </w:r>
       <w:r>
         <w:rPr>
           <w:rFonts w:ascii="Helvetica Neue" w:hAnsi="Helvetica Neue" w:eastAsia="PingFang SC"/>
           <w:sz w:val="21"/>
         </w:rPr>
-        <w:t>：导入/校验/推送前扫描凭据模式；报告不回显密钥；越权/越界证据引用拒绝；</w:t>
+        <w:t>: credential patterns are scanned before import/validation/push; reports never echo keys; out-of-scope/out-of-bounds evidence references are rejected;</w:t>
       </w:r>
     </w:p>
     <w:p>
@@ -4059,14 +4050,14 @@
           <w:b/>
           <w:sz w:val="21"/>
         </w:rPr>
-        <w:t>注入防护</w:t>
+        <w:t>Injection protection</w:t>
       </w:r>
       <w:r>
         <w:rPr>
           <w:rFonts w:ascii="Helvetica Neue" w:hAnsi="Helvetica Neue" w:eastAsia="PingFang SC"/>
           <w:sz w:val="21"/>
         </w:rPr>
-        <w:t>：证据中“忽略指令/执行命令/外传”类文本不执行、不进入报告，模型输出二次中和；</w:t>
+        <w:t>: text in evidence that says "ignore instructions / execute commands / exfiltrate" is neither executed nor copied into reports, and model output is neutralized again;</w:t>
       </w:r>
     </w:p>
     <w:p>
@@ -4079,23 +4070,14 @@
           <w:b/>
           <w:sz w:val="21"/>
         </w:rPr>
-        <w:t>遥测默认关闭</w:t>
+        <w:t>Telemetry off by default</w:t>
       </w:r>
       <w:r>
         <w:rPr>
           <w:rFonts w:ascii="Helvetica Neue" w:hAnsi="Helvetica Neue" w:eastAsia="PingFang SC"/>
           <w:sz w:val="21"/>
         </w:rPr>
-        <w:t>：仅 10 个白名单字段（版本/OS/架构/模式/耗时/证据条数等），绝不采集集群、</w:t>
-      </w:r>
-    </w:p>
-    <w:p>
-      <w:r>
-        <w:rPr>
-          <w:rFonts w:ascii="Helvetica Neue" w:hAnsi="Helvetica Neue" w:eastAsia="PingFang SC"/>
-          <w:sz w:val="21"/>
-        </w:rPr>
-        <w:t>命名空间、日志、证据正文、路径、密钥；</w:t>
+        <w:t xml:space="preserve">: only 10 allowlisted fields (version/OS/architecture/mode/duration/ evidence count, etc.); cluster, namespace, logs, evidence bodies, paths and keys are never collected; </w:t>
       </w:r>
       <w:r>
         <w:rPr>
@@ -4110,7 +4092,7 @@
           <w:rFonts w:ascii="Helvetica Neue" w:hAnsi="Helvetica Neue" w:eastAsia="PingFang SC"/>
           <w:sz w:val="21"/>
         </w:rPr>
-        <w:t xml:space="preserve"> 强制关闭；</w:t>
+        <w:t xml:space="preserve"> forces it off;</w:t>
       </w:r>
     </w:p>
     <w:p>
@@ -4123,14 +4105,14 @@
           <w:b/>
           <w:sz w:val="21"/>
         </w:rPr>
-        <w:t>供应链</w:t>
+        <w:t>Supply chain</w:t>
       </w:r>
       <w:r>
         <w:rPr>
           <w:rFonts w:ascii="Helvetica Neue" w:hAnsi="Helvetica Neue" w:eastAsia="PingFang SC"/>
           <w:sz w:val="21"/>
         </w:rPr>
-        <w:t>：Release 提供 sha256 + cosign keyless 签名 + CycloneDX SBOM；GHCR 镜像按 digest 签名。</w:t>
+        <w:t>: releases provide sha256 + cosign keyless signatures + CycloneDX SBOMs; GHCR images are signed by digest.</w:t>
       </w:r>
     </w:p>
     <w:p>
@@ -4139,14 +4121,14 @@
           <w:rFonts w:ascii="Helvetica Neue" w:hAnsi="Helvetica Neue" w:eastAsia="PingFang SC"/>
           <w:sz w:val="21"/>
         </w:rPr>
-        <w:t xml:space="preserve">详见 </w:t>
+        <w:t xml:space="preserve">See </w:t>
       </w:r>
       <w:r>
         <w:rPr>
           <w:rFonts w:ascii="Helvetica Neue" w:hAnsi="Helvetica Neue" w:eastAsia="PingFang SC"/>
           <w:sz w:val="21"/>
         </w:rPr>
-        <w:t>安全与数据流</w:t>
+        <w:t>Security and data flow (Chinese)</w:t>
       </w:r>
       <w:r>
         <w:rPr>
@@ -4161,7 +4143,7 @@
           <w:rFonts w:ascii="Helvetica Neue" w:hAnsi="Helvetica Neue" w:eastAsia="PingFang SC"/>
           <w:sz w:val="21"/>
         </w:rPr>
-        <w:t>。</w:t>
+        <w:t xml:space="preserve"> for details.</w:t>
       </w:r>
     </w:p>
     <w:p>
@@ -4169,7 +4151,7 @@
         <w:pStyle w:val="Heading1"/>
       </w:pPr>
       <w:r>
-        <w:t>10. 分发与供应链</w:t>
+        <w:t>10. Distribution and Supply Chain</w:t>
       </w:r>
     </w:p>
     <w:tbl>
@@ -4196,7 +4178,7 @@
                 <w:b/>
                 <w:sz w:val="18"/>
               </w:rPr>
-              <w:t>渠道</w:t>
+              <w:t>Channel</w:t>
             </w:r>
           </w:p>
         </w:tc>
@@ -4212,7 +4194,7 @@
                 <w:b/>
                 <w:sz w:val="18"/>
               </w:rPr>
-              <w:t>状态</w:t>
+              <w:t>Status</w:t>
             </w:r>
           </w:p>
         </w:tc>
@@ -4228,7 +4210,7 @@
                 <w:rFonts w:ascii="Helvetica Neue" w:hAnsi="Helvetica Neue" w:eastAsia="PingFang SC"/>
                 <w:sz w:val="18"/>
               </w:rPr>
-              <w:t xml:space="preserve">源码 </w:t>
+              <w:t xml:space="preserve">Source </w:t>
             </w:r>
             <w:r>
               <w:rPr>
@@ -4266,7 +4248,7 @@
                 <w:rFonts w:ascii="Helvetica Neue" w:hAnsi="Helvetica Neue" w:eastAsia="PingFang SC"/>
                 <w:sz w:val="18"/>
               </w:rPr>
-              <w:t>Release 资产（darwin/linux × amd64/arm64 + windows/amd64）</w:t>
+              <w:t>Release assets (darwin/linux × amd64/arm64 + windows/amd64)</w:t>
             </w:r>
           </w:p>
         </w:tc>
@@ -4280,7 +4262,7 @@
                 <w:rFonts w:ascii="Helvetica Neue" w:hAnsi="Helvetica Neue" w:eastAsia="PingFang SC"/>
                 <w:sz w:val="18"/>
               </w:rPr>
-              <w:t>✅ v0.5.0 起含 Windows</w:t>
+              <w:t>✅ Windows included since v0.5.0</w:t>
             </w:r>
           </w:p>
         </w:tc>
@@ -4296,7 +4278,7 @@
                 <w:rFonts w:ascii="Helvetica Neue" w:hAnsi="Helvetica Neue" w:eastAsia="PingFang SC"/>
                 <w:sz w:val="18"/>
               </w:rPr>
-              <w:t>Docker：</w:t>
+              <w:t xml:space="preserve">Docker: </w:t>
             </w:r>
             <w:r>
               <w:rPr>
@@ -4311,7 +4293,7 @@
                 <w:rFonts w:ascii="Helvetica Neue" w:hAnsi="Helvetica Neue" w:eastAsia="PingFang SC"/>
                 <w:sz w:val="18"/>
               </w:rPr>
-              <w:t>（distroless/nonroot）</w:t>
+              <w:t xml:space="preserve"> (distroless/nonroot)</w:t>
             </w:r>
           </w:p>
         </w:tc>
@@ -4325,7 +4307,7 @@
                 <w:rFonts w:ascii="Helvetica Neue" w:hAnsi="Helvetica Neue" w:eastAsia="PingFang SC"/>
                 <w:sz w:val="18"/>
               </w:rPr>
-              <w:t>✅ v0.3.0 起</w:t>
+              <w:t>✅ since v0.3.0</w:t>
             </w:r>
           </w:p>
         </w:tc>
@@ -4341,7 +4323,7 @@
                 <w:rFonts w:ascii="Helvetica Neue" w:hAnsi="Helvetica Neue" w:eastAsia="PingFang SC"/>
                 <w:sz w:val="18"/>
               </w:rPr>
-              <w:t>Homebrew：</w:t>
+              <w:t xml:space="preserve">Homebrew: </w:t>
             </w:r>
             <w:r>
               <w:rPr>
@@ -4363,7 +4345,7 @@
                 <w:rFonts w:ascii="Helvetica Neue" w:hAnsi="Helvetica Neue" w:eastAsia="PingFang SC"/>
                 <w:sz w:val="18"/>
               </w:rPr>
-              <w:t>✅ 自动同步 formula</w:t>
+              <w:t>✅ formula synced automatically</w:t>
             </w:r>
           </w:p>
         </w:tc>
@@ -4379,7 +4361,7 @@
                 <w:rFonts w:ascii="Helvetica Neue" w:hAnsi="Helvetica Neue" w:eastAsia="PingFang SC"/>
                 <w:sz w:val="18"/>
               </w:rPr>
-              <w:t>文档站：https://paas-ops.github.io/kubectl-triage/</w:t>
+              <w:t>Documentation site: https://paas-ops.github.io/kubectl-triage/</w:t>
             </w:r>
           </w:p>
         </w:tc>
@@ -4409,7 +4391,7 @@
                 <w:rFonts w:ascii="Helvetica Neue" w:hAnsi="Helvetica Neue" w:eastAsia="PingFang SC"/>
                 <w:sz w:val="18"/>
               </w:rPr>
-              <w:t>签名/SBOM 校验</w:t>
+              <w:t>Signature/SBOM verification</w:t>
             </w:r>
           </w:p>
         </w:tc>
@@ -4468,7 +4450,7 @@
                 <w:rFonts w:ascii="Helvetica Neue" w:hAnsi="Helvetica Neue" w:eastAsia="PingFang SC"/>
                 <w:sz w:val="18"/>
               </w:rPr>
-              <w:t>，</w:t>
+              <w:t xml:space="preserve">; </w:t>
             </w:r>
             <w:r>
               <w:rPr>
@@ -4483,7 +4465,7 @@
                 <w:rFonts w:ascii="Helvetica Neue" w:hAnsi="Helvetica Neue" w:eastAsia="PingFang SC"/>
                 <w:sz w:val="18"/>
               </w:rPr>
-              <w:t xml:space="preserve"> 可复验</w:t>
+              <w:t xml:space="preserve"> can re-check</w:t>
             </w:r>
           </w:p>
         </w:tc>
@@ -4496,10 +4478,8 @@
           <w:rFonts w:ascii="Helvetica Neue" w:hAnsi="Helvetica Neue" w:eastAsia="PingFang SC"/>
           <w:sz w:val="21"/>
         </w:rPr>
-        <w:t>发布流程：tag push → release workflow（GoReleaser v2.15.4 + cosign + SBOM + GHCR + 发布自校验）→</w:t>
+        <w:t xml:space="preserve">Release pipeline: tag push → release workflow (GoReleaser v2.15.4 + cosign + SBOM + GHCR + release self-verification) → </w:t>
       </w:r>
-    </w:p>
-    <w:p>
       <w:r>
         <w:rPr>
           <w:rFonts w:ascii="Menlo" w:hAnsi="Menlo" w:eastAsia="PingFang SC"/>
@@ -4513,14 +4493,14 @@
           <w:rFonts w:ascii="Helvetica Neue" w:hAnsi="Helvetica Neue" w:eastAsia="PingFang SC"/>
           <w:sz w:val="21"/>
         </w:rPr>
-        <w:t xml:space="preserve"> 复验 → tap 自动同步。安装与校验见 </w:t>
+        <w:t xml:space="preserve"> re-check → tap auto-sync. See </w:t>
       </w:r>
       <w:r>
         <w:rPr>
           <w:rFonts w:ascii="Helvetica Neue" w:hAnsi="Helvetica Neue" w:eastAsia="PingFang SC"/>
           <w:sz w:val="21"/>
         </w:rPr>
-        <w:t>安装与校验</w:t>
+        <w:t>Install and verify (Chinese)</w:t>
       </w:r>
       <w:r>
         <w:rPr>
@@ -4535,7 +4515,7 @@
           <w:rFonts w:ascii="Helvetica Neue" w:hAnsi="Helvetica Neue" w:eastAsia="PingFang SC"/>
           <w:sz w:val="21"/>
         </w:rPr>
-        <w:t>。</w:t>
+        <w:t xml:space="preserve"> for installation and verification.</w:t>
       </w:r>
     </w:p>
     <w:p>
@@ -4543,7 +4523,7 @@
         <w:pStyle w:val="Heading1"/>
       </w:pPr>
       <w:r>
-        <w:t>11. 质量工程</w:t>
+        <w:t>11. Quality Engineering</w:t>
       </w:r>
     </w:p>
     <w:tbl>
@@ -4570,7 +4550,7 @@
                 <w:b/>
                 <w:sz w:val="18"/>
               </w:rPr>
-              <w:t>项</w:t>
+              <w:t>Item</w:t>
             </w:r>
           </w:p>
         </w:tc>
@@ -4586,7 +4566,7 @@
                 <w:b/>
                 <w:sz w:val="18"/>
               </w:rPr>
-              <w:t>数值/做法（v0.5.0）</w:t>
+              <w:t>Value/practice (v0.5.0)</w:t>
             </w:r>
           </w:p>
         </w:tc>
@@ -4602,7 +4582,7 @@
                 <w:rFonts w:ascii="Helvetica Neue" w:hAnsi="Helvetica Neue" w:eastAsia="PingFang SC"/>
                 <w:sz w:val="18"/>
               </w:rPr>
-              <w:t>Go 包</w:t>
+              <w:t>Go packages</w:t>
             </w:r>
           </w:p>
         </w:tc>
@@ -4616,7 +4596,7 @@
                 <w:rFonts w:ascii="Helvetica Neue" w:hAnsi="Helvetica Neue" w:eastAsia="PingFang SC"/>
                 <w:sz w:val="18"/>
               </w:rPr>
-              <w:t>18 个（16 个有测试，2 个无测试包为装配层）</w:t>
+              <w:t>18 (16 with tests; the 2 untested packages are assembly layers)</w:t>
             </w:r>
           </w:p>
         </w:tc>
@@ -4632,7 +4612,7 @@
                 <w:rFonts w:ascii="Helvetica Neue" w:hAnsi="Helvetica Neue" w:eastAsia="PingFang SC"/>
                 <w:sz w:val="18"/>
               </w:rPr>
-              <w:t>代码规模</w:t>
+              <w:t>Code size</w:t>
             </w:r>
           </w:p>
         </w:tc>
@@ -4646,7 +4626,7 @@
                 <w:rFonts w:ascii="Helvetica Neue" w:hAnsi="Helvetica Neue" w:eastAsia="PingFang SC"/>
                 <w:sz w:val="18"/>
               </w:rPr>
-              <w:t>约 19k 行 Go（其中测试约 10k 行）</w:t>
+              <w:t>~19k lines of Go (~10k lines of tests)</w:t>
             </w:r>
           </w:p>
         </w:tc>
@@ -4662,7 +4642,7 @@
                 <w:rFonts w:ascii="Helvetica Neue" w:hAnsi="Helvetica Neue" w:eastAsia="PingFang SC"/>
                 <w:sz w:val="18"/>
               </w:rPr>
-              <w:t>golden 用例</w:t>
+              <w:t>Golden cases</w:t>
             </w:r>
           </w:p>
         </w:tc>
@@ -4676,7 +4656,7 @@
                 <w:rFonts w:ascii="Helvetica Neue" w:hAnsi="Helvetica Neue" w:eastAsia="PingFang SC"/>
                 <w:sz w:val="18"/>
               </w:rPr>
-              <w:t>12 个（五类×2 + 缺失 + 注入），严格比对 + 确定性 + 反证不相交</w:t>
+              <w:t>12 (five classes × 2 + missing + injection), strict comparison + determinism + non-intersecting counter-evidence</w:t>
             </w:r>
           </w:p>
         </w:tc>
@@ -4692,7 +4672,7 @@
                 <w:rFonts w:ascii="Helvetica Neue" w:hAnsi="Helvetica Neue" w:eastAsia="PingFang SC"/>
                 <w:sz w:val="18"/>
               </w:rPr>
-              <w:t>评测</w:t>
+              <w:t>Evaluation</w:t>
             </w:r>
           </w:p>
         </w:tc>
@@ -4714,7 +4694,7 @@
                 <w:rFonts w:ascii="Helvetica Neue" w:hAnsi="Helvetica Neue" w:eastAsia="PingFang SC"/>
                 <w:sz w:val="18"/>
               </w:rPr>
-              <w:t xml:space="preserve"> 评分（Top1/Top3/缺失/注入/降级）+ </w:t>
+              <w:t xml:space="preserve"> scoring (Top1/Top3/missing/injection/degraded) + </w:t>
             </w:r>
             <w:r>
               <w:rPr>
@@ -4729,7 +4709,7 @@
                 <w:rFonts w:ascii="Helvetica Neue" w:hAnsi="Helvetica Neue" w:eastAsia="PingFang SC"/>
                 <w:sz w:val="18"/>
               </w:rPr>
-              <w:t xml:space="preserve"> 集合结构门禁 + </w:t>
+              <w:t xml:space="preserve"> structure gate + </w:t>
             </w:r>
             <w:r>
               <w:rPr>
@@ -4744,7 +4724,7 @@
                 <w:rFonts w:ascii="Helvetica Neue" w:hAnsi="Helvetica Neue" w:eastAsia="PingFang SC"/>
                 <w:sz w:val="18"/>
               </w:rPr>
-              <w:t xml:space="preserve"> 基线回归门禁</w:t>
+              <w:t xml:space="preserve"> baseline regression gate</w:t>
             </w:r>
           </w:p>
         </w:tc>
@@ -4774,7 +4754,7 @@
                 <w:rFonts w:ascii="Helvetica Neue" w:hAnsi="Helvetica Neue" w:eastAsia="PingFang SC"/>
                 <w:sz w:val="18"/>
               </w:rPr>
-              <w:t>4 个 workflow：ci（test/cross-build/windows-test/release-check/docker-build）、release、verify-release、pages</w:t>
+              <w:t>4 workflows: ci (test/cross-build/windows-test/release-check/docker-build), release, verify-release, pages</w:t>
             </w:r>
           </w:p>
         </w:tc>
@@ -4790,7 +4770,7 @@
                 <w:rFonts w:ascii="Helvetica Neue" w:hAnsi="Helvetica Neue" w:eastAsia="PingFang SC"/>
                 <w:sz w:val="18"/>
               </w:rPr>
-              <w:t>契约门禁</w:t>
+              <w:t>Contract gates</w:t>
             </w:r>
           </w:p>
         </w:tc>
@@ -4804,7 +4784,7 @@
                 <w:rFonts w:ascii="Helvetica Neue" w:hAnsi="Helvetica Neue" w:eastAsia="PingFang SC"/>
                 <w:sz w:val="18"/>
               </w:rPr>
-              <w:t>schema 基线测试、golden expected schema 校验、release 自验签</w:t>
+              <w:t>schema baseline tests, golden expected-report schema validation, release self-verification</w:t>
             </w:r>
           </w:p>
         </w:tc>
@@ -4820,7 +4800,7 @@
                 <w:rFonts w:ascii="Helvetica Neue" w:hAnsi="Helvetica Neue" w:eastAsia="PingFang SC"/>
                 <w:sz w:val="18"/>
               </w:rPr>
-              <w:t>默认离线测试</w:t>
+              <w:t>Offline-default tests</w:t>
             </w:r>
           </w:p>
         </w:tc>
@@ -4834,7 +4814,7 @@
                 <w:rFonts w:ascii="Helvetica Neue" w:hAnsi="Helvetica Neue" w:eastAsia="PingFang SC"/>
                 <w:sz w:val="18"/>
               </w:rPr>
-              <w:t>push/model/telemetry 全部 stub/httptest，不触网</w:t>
+              <w:t>push/model/telemetry all use stubs/httptest; no network access</w:t>
             </w:r>
           </w:p>
         </w:tc>
@@ -4846,7 +4826,7 @@
         <w:pStyle w:val="Heading1"/>
       </w:pPr>
       <w:r>
-        <w:t>12. 里程碑与版本</w:t>
+        <w:t>12. Milestones and Releases</w:t>
       </w:r>
     </w:p>
     <w:tbl>
@@ -4875,7 +4855,7 @@
                 <w:b/>
                 <w:sz w:val="18"/>
               </w:rPr>
-              <w:t>里程碑</w:t>
+              <w:t>Milestone</w:t>
             </w:r>
           </w:p>
         </w:tc>
@@ -4891,7 +4871,7 @@
                 <w:b/>
                 <w:sz w:val="18"/>
               </w:rPr>
-              <w:t>版本</w:t>
+              <w:t>Version</w:t>
             </w:r>
           </w:p>
         </w:tc>
@@ -4907,7 +4887,7 @@
                 <w:b/>
                 <w:sz w:val="18"/>
               </w:rPr>
-              <w:t>交付</w:t>
+              <w:t>Deliverables</w:t>
             </w:r>
           </w:p>
         </w:tc>
@@ -4923,7 +4903,7 @@
                 <w:b/>
                 <w:sz w:val="18"/>
               </w:rPr>
-              <w:t>验证</w:t>
+              <w:t>Verification</w:t>
             </w:r>
           </w:p>
         </w:tc>
@@ -4939,7 +4919,7 @@
                 <w:rFonts w:ascii="Helvetica Neue" w:hAnsi="Helvetica Neue" w:eastAsia="PingFang SC"/>
                 <w:sz w:val="18"/>
               </w:rPr>
-              <w:t>M0 立项/骨架</w:t>
+              <w:t>M0 inception/skeleton</w:t>
             </w:r>
           </w:p>
         </w:tc>
@@ -4967,7 +4947,7 @@
                 <w:rFonts w:ascii="Helvetica Neue" w:hAnsi="Helvetica Neue" w:eastAsia="PingFang SC"/>
                 <w:sz w:val="18"/>
               </w:rPr>
-              <w:t>仓库、license、schema v0、CLI 骨架、CI</w:t>
+              <w:t>Repository, license, schema v0, CLI skeleton, CI</w:t>
             </w:r>
           </w:p>
         </w:tc>
@@ -4981,7 +4961,7 @@
                 <w:rFonts w:ascii="Helvetica Neue" w:hAnsi="Helvetica Neue" w:eastAsia="PingFang SC"/>
                 <w:sz w:val="18"/>
               </w:rPr>
-              <w:t>初始提交，CI 绿</w:t>
+              <w:t>Initial commit, CI green</w:t>
             </w:r>
           </w:p>
         </w:tc>
@@ -4997,7 +4977,7 @@
                 <w:rFonts w:ascii="Helvetica Neue" w:hAnsi="Helvetica Neue" w:eastAsia="PingFang SC"/>
                 <w:sz w:val="18"/>
               </w:rPr>
-              <w:t>M1 离线 MVP</w:t>
+              <w:t>M1 offline MVP</w:t>
             </w:r>
           </w:p>
         </w:tc>
@@ -5025,7 +5005,7 @@
                 <w:rFonts w:ascii="Helvetica Neue" w:hAnsi="Helvetica Neue" w:eastAsia="PingFang SC"/>
                 <w:sz w:val="18"/>
               </w:rPr>
-              <w:t>契约（schema/退出码）、四导入器、脱敏、五类规则、12 golden、报告</w:t>
+              <w:t>Contracts (schema/exit codes), four importers, redaction, five failure rules, 12 golden, reports</w:t>
             </w:r>
           </w:p>
         </w:tc>
@@ -5039,7 +5019,7 @@
                 <w:rFonts w:ascii="Helvetica Neue" w:hAnsi="Helvetica Neue" w:eastAsia="PingFang SC"/>
                 <w:sz w:val="18"/>
               </w:rPr>
-              <w:t>13 包测试、12/12 golden、CI 5/5</w:t>
+              <w:t>13 package tests, 12/12 golden, CI 5/5</w:t>
             </w:r>
           </w:p>
         </w:tc>
@@ -5055,7 +5035,7 @@
                 <w:rFonts w:ascii="Helvetica Neue" w:hAnsi="Helvetica Neue" w:eastAsia="PingFang SC"/>
                 <w:sz w:val="18"/>
               </w:rPr>
-              <w:t>M2 模型/评测</w:t>
+              <w:t>M2 model/evaluation</w:t>
             </w:r>
           </w:p>
         </w:tc>
@@ -5083,7 +5063,7 @@
                 <w:rFonts w:ascii="Helvetica Neue" w:hAnsi="Helvetica Neue" w:eastAsia="PingFang SC"/>
                 <w:sz w:val="18"/>
               </w:rPr>
-              <w:t>OpenAI-compatible/Ollama、预算/超时/降级、注入防护、本地 eval</w:t>
+              <w:t>OpenAI-compatible/Ollama, budget/timeout/degradation, injection protection, local eval</w:t>
             </w:r>
           </w:p>
         </w:tc>
@@ -5097,7 +5077,7 @@
                 <w:rFonts w:ascii="Helvetica Neue" w:hAnsi="Helvetica Neue" w:eastAsia="PingFang SC"/>
                 <w:sz w:val="18"/>
               </w:rPr>
-              <w:t>15 包测试、模型 stub E2E、eval 12/12</w:t>
+              <w:t>15 package tests, model stub E2E, eval 12/12</w:t>
             </w:r>
           </w:p>
         </w:tc>
@@ -5113,7 +5093,7 @@
                 <w:rFonts w:ascii="Helvetica Neue" w:hAnsi="Helvetica Neue" w:eastAsia="PingFang SC"/>
                 <w:sz w:val="18"/>
               </w:rPr>
-              <w:t>M3 Beta 分发</w:t>
+              <w:t>M3 beta distribution</w:t>
             </w:r>
           </w:p>
         </w:tc>
@@ -5141,7 +5121,7 @@
                 <w:rFonts w:ascii="Helvetica Neue" w:hAnsi="Helvetica Neue" w:eastAsia="PingFang SC"/>
                 <w:sz w:val="18"/>
               </w:rPr>
-              <w:t>GoReleaser 产物、cosign/SBOM、GHCR、Homebrew、Pages 站点、opt-in 遥测</w:t>
+              <w:t>GoReleaser artifacts, cosign/SBOM, GHCR, Homebrew, Pages site, opt-in telemetry</w:t>
             </w:r>
           </w:p>
         </w:tc>
@@ -5155,7 +5135,7 @@
                 <w:rFonts w:ascii="Helvetica Neue" w:hAnsi="Helvetica Neue" w:eastAsia="PingFang SC"/>
                 <w:sz w:val="18"/>
               </w:rPr>
-              <w:t>Release 12 资产、verify-release 绿</w:t>
+              <w:t>Release 12 assets, verify-release green</w:t>
             </w:r>
           </w:p>
         </w:tc>
@@ -5171,7 +5151,7 @@
                 <w:rFonts w:ascii="Helvetica Neue" w:hAnsi="Helvetica Neue" w:eastAsia="PingFang SC"/>
                 <w:sz w:val="18"/>
               </w:rPr>
-              <w:t>M3.1 加固</w:t>
+              <w:t>M3.1 hardening</w:t>
             </w:r>
           </w:p>
         </w:tc>
@@ -5199,7 +5179,7 @@
                 <w:rFonts w:ascii="Helvetica Neue" w:hAnsi="Helvetica Neue" w:eastAsia="PingFang SC"/>
                 <w:sz w:val="18"/>
               </w:rPr>
-              <w:t>tap 自动同步（无 PAT）、发布自验签、评测集契约</w:t>
+              <w:t>Tap auto-sync (no PAT), release self-verification, evaluation-set contract</w:t>
             </w:r>
           </w:p>
         </w:tc>
@@ -5213,7 +5193,7 @@
                 <w:rFonts w:ascii="Helvetica Neue" w:hAnsi="Helvetica Neue" w:eastAsia="PingFang SC"/>
                 <w:sz w:val="18"/>
               </w:rPr>
-              <w:t>tap sync 成功、verify-release 复验</w:t>
+              <w:t>tap sync success, verify-release re-check</w:t>
             </w:r>
           </w:p>
         </w:tc>
@@ -5229,7 +5209,7 @@
                 <w:rFonts w:ascii="Helvetica Neue" w:hAnsi="Helvetica Neue" w:eastAsia="PingFang SC"/>
                 <w:sz w:val="18"/>
               </w:rPr>
-              <w:t>M4 企业桥</w:t>
+              <w:t>M4 enterprise bridge</w:t>
             </w:r>
           </w:p>
         </w:tc>
@@ -5257,7 +5237,7 @@
                 <w:rFonts w:ascii="Helvetica Neue" w:hAnsi="Helvetica Neue" w:eastAsia="PingFang SC"/>
                 <w:sz w:val="18"/>
               </w:rPr>
-              <w:t>push 客户端（协议 v1.0、幂等/重试/dry-run/证据包）、企业边界/试点/指标文档</w:t>
+              <w:t>Push client (protocol v1.0, idempotency/retry/dry-run/evidence bundle), enterprise boundary/pilot/metrics docs</w:t>
             </w:r>
           </w:p>
         </w:tc>
@@ -5271,7 +5251,7 @@
                 <w:rFonts w:ascii="Helvetica Neue" w:hAnsi="Helvetica Neue" w:eastAsia="PingFang SC"/>
                 <w:sz w:val="18"/>
               </w:rPr>
-              <w:t>E2E 8 场景、Release 12 资产、verify-release</w:t>
+              <w:t>E2E 8 scenarios, Release 12 assets, verify-release</w:t>
             </w:r>
           </w:p>
         </w:tc>
@@ -5287,7 +5267,7 @@
                 <w:rFonts w:ascii="Helvetica Neue" w:hAnsi="Helvetica Neue" w:eastAsia="PingFang SC"/>
                 <w:sz w:val="18"/>
               </w:rPr>
-              <w:t>M5 v1.0 准备</w:t>
+              <w:t>M5 v1.0 preparation</w:t>
             </w:r>
           </w:p>
         </w:tc>
@@ -5315,7 +5295,7 @@
                 <w:rFonts w:ascii="Helvetica Neue" w:hAnsi="Helvetica Neue" w:eastAsia="PingFang SC"/>
                 <w:sz w:val="18"/>
               </w:rPr>
-              <w:t>schema 兼容基线、Windows amd64、eval --validate</w:t>
+              <w:t>Schema compatibility baseline, Windows amd64, eval --validate</w:t>
             </w:r>
           </w:p>
         </w:tc>
@@ -5329,7 +5309,7 @@
                 <w:rFonts w:ascii="Helvetica Neue" w:hAnsi="Helvetica Neue" w:eastAsia="PingFang SC"/>
                 <w:sz w:val="18"/>
               </w:rPr>
-              <w:t>16 测试包、windows-test、Release 14 资产</w:t>
+              <w:t>16 tested packages, windows-test, Release 14 assets</w:t>
             </w:r>
           </w:p>
         </w:tc>
@@ -5350,7 +5330,7 @@
           <w:color w:val="595959"/>
           <w:sz w:val="19"/>
         </w:rPr>
-        <w:t>完整 ADR：契约口径（ADR-002）、M1–M4 实现口径（ADR-003–006）、v1.0 准备（ADR-007）。</w:t>
+        <w:t>Complete ADRs: contract decisions (ADR-002), M1–M4 implementation decisions (ADR-003–006), v1.0 preparation (ADR-007).</w:t>
       </w:r>
     </w:p>
     <w:p>
@@ -5358,7 +5338,7 @@
         <w:pStyle w:val="Heading1"/>
       </w:pPr>
       <w:r>
-        <w:t>13. 指标与运营</w:t>
+        <w:t>13. Metrics and Operations</w:t>
       </w:r>
     </w:p>
     <w:p>
@@ -5367,7 +5347,7 @@
           <w:rFonts w:ascii="Helvetica Neue" w:hAnsi="Helvetica Neue" w:eastAsia="PingFang SC"/>
           <w:sz w:val="21"/>
         </w:rPr>
-        <w:t>北极星不是 Star，而是四层漏斗：</w:t>
+        <w:t>The north star is not GitHub Stars but a four-stage funnel:</w:t>
       </w:r>
     </w:p>
     <w:p>
@@ -5380,14 +5360,14 @@
           <w:b/>
           <w:sz w:val="21"/>
         </w:rPr>
-        <w:t>实际安装</w:t>
+        <w:t>Actual installs</w:t>
       </w:r>
       <w:r>
         <w:rPr>
           <w:rFonts w:ascii="Helvetica Neue" w:hAnsi="Helvetica Neue" w:eastAsia="PingFang SC"/>
           <w:sz w:val="21"/>
         </w:rPr>
-        <w:t>：Release 下载 / Homebrew analytics / GHCR 拉取（去重）；</w:t>
+        <w:t>: Release downloads / Homebrew analytics / GHCR pulls (deduplicated);</w:t>
       </w:r>
     </w:p>
     <w:p>
@@ -5400,14 +5380,14 @@
           <w:b/>
           <w:sz w:val="21"/>
         </w:rPr>
-        <w:t>激活</w:t>
+        <w:t>Activation</w:t>
       </w:r>
       <w:r>
         <w:rPr>
           <w:rFonts w:ascii="Helvetica Neue" w:hAnsi="Helvetica Neue" w:eastAsia="PingFang SC"/>
           <w:sz w:val="21"/>
         </w:rPr>
-        <w:t xml:space="preserve">：opt-in </w:t>
+        <w:t xml:space="preserve">: opt-in </w:t>
       </w:r>
       <w:r>
         <w:rPr>
@@ -5422,7 +5402,7 @@
           <w:rFonts w:ascii="Helvetica Neue" w:hAnsi="Helvetica Neue" w:eastAsia="PingFang SC"/>
           <w:sz w:val="21"/>
         </w:rPr>
-        <w:t xml:space="preserve"> 事件（首次成功生成报告）；</w:t>
+        <w:t xml:space="preserve"> event (first successful report generation);</w:t>
       </w:r>
     </w:p>
     <w:p>
@@ -5435,14 +5415,14 @@
           <w:b/>
           <w:sz w:val="21"/>
         </w:rPr>
-        <w:t>重复使用</w:t>
+        <w:t>Repeat usage</w:t>
       </w:r>
       <w:r>
         <w:rPr>
           <w:rFonts w:ascii="Helvetica Neue" w:hAnsi="Helvetica Neue" w:eastAsia="PingFang SC"/>
           <w:sz w:val="21"/>
         </w:rPr>
-        <w:t>：激活后 4 周内 ≥2 次成功诊断（install_id 去重）；</w:t>
+        <w:t>: at least 2 successful diagnoses within 4 weeks after activation (deduplicated by install_id);</w:t>
       </w:r>
     </w:p>
     <w:p>
@@ -5455,14 +5435,14 @@
           <w:b/>
           <w:sz w:val="21"/>
         </w:rPr>
-        <w:t>企业试点</w:t>
+        <w:t>Enterprise pilots</w:t>
       </w:r>
       <w:r>
         <w:rPr>
           <w:rFonts w:ascii="Helvetica Neue" w:hAnsi="Helvetica Neue" w:eastAsia="PingFang SC"/>
           <w:sz w:val="21"/>
         </w:rPr>
-        <w:t>：合格申请 ≥10、进入试点 ≥3、转正/付费（90 天商业门槛）。</w:t>
+        <w:t>: ≥10 qualified applications, ≥3 entering a pilot, conversion/payment (the 90-day commercial threshold).</w:t>
       </w:r>
     </w:p>
     <w:p>
@@ -5471,7 +5451,7 @@
           <w:rFonts w:ascii="Helvetica Neue" w:hAnsi="Helvetica Neue" w:eastAsia="PingFang SC"/>
           <w:sz w:val="21"/>
         </w:rPr>
-        <w:t>当前状态：工具链已就绪（遥测客户端、试点 issue 表单、playbook、周报模板），</w:t>
+        <w:t xml:space="preserve">Current status: the tooling is ready (telemetry client, pilot issue form, playbook, weekly report template), but </w:t>
       </w:r>
       <w:r>
         <w:rPr>
@@ -5479,23 +5459,21 @@
           <w:b/>
           <w:sz w:val="21"/>
         </w:rPr>
-        <w:t>真实数字依赖对外发布与运营</w:t>
-      </w:r>
-    </w:p>
-    <w:p>
-      <w:r>
-        <w:rPr>
-          <w:rFonts w:ascii="Helvetica Neue" w:hAnsi="Helvetica Neue" w:eastAsia="PingFang SC"/>
-          <w:sz w:val="21"/>
-        </w:rPr>
-        <w:t xml:space="preserve">（截至 v0.5.0 尚未开始外部推广）。定义与周报模板见 </w:t>
+        <w:t>real numbers depend on external release and operations</w:t>
       </w:r>
       <w:r>
         <w:rPr>
           <w:rFonts w:ascii="Helvetica Neue" w:hAnsi="Helvetica Neue" w:eastAsia="PingFang SC"/>
           <w:sz w:val="21"/>
         </w:rPr>
-        <w:t>指标漏斗</w:t>
+        <w:t xml:space="preserve"> (as of v0.5.0, external promotion has not started yet). Definitions and the weekly report template are in </w:t>
+      </w:r>
+      <w:r>
+        <w:rPr>
+          <w:rFonts w:ascii="Helvetica Neue" w:hAnsi="Helvetica Neue" w:eastAsia="PingFang SC"/>
+          <w:sz w:val="21"/>
+        </w:rPr>
+        <w:t>Metrics funnel (Chinese)</w:t>
       </w:r>
       <w:r>
         <w:rPr>
@@ -5510,7 +5488,7 @@
           <w:rFonts w:ascii="Helvetica Neue" w:hAnsi="Helvetica Neue" w:eastAsia="PingFang SC"/>
           <w:sz w:val="21"/>
         </w:rPr>
-        <w:t>。</w:t>
+        <w:t>.</w:t>
       </w:r>
     </w:p>
     <w:p>
@@ -5518,7 +5496,7 @@
         <w:pStyle w:val="Heading1"/>
       </w:pPr>
       <w:r>
-        <w:t>14. 路线图与下一步</w:t>
+        <w:t>14. Roadmap and Next Steps</w:t>
       </w:r>
     </w:p>
     <w:tbl>
@@ -5546,7 +5524,7 @@
                 <w:b/>
                 <w:sz w:val="18"/>
               </w:rPr>
-              <w:t>优先级</w:t>
+              <w:t>Priority</w:t>
             </w:r>
           </w:p>
         </w:tc>
@@ -5562,7 +5540,7 @@
                 <w:b/>
                 <w:sz w:val="18"/>
               </w:rPr>
-              <w:t>事项</w:t>
+              <w:t>Item</w:t>
             </w:r>
           </w:p>
         </w:tc>
@@ -5578,7 +5556,7 @@
                 <w:b/>
                 <w:sz w:val="18"/>
               </w:rPr>
-              <w:t>负责方</w:t>
+              <w:t>Owner</w:t>
             </w:r>
           </w:p>
         </w:tc>
@@ -5608,7 +5586,7 @@
                 <w:rFonts w:ascii="Helvetica Neue" w:hAnsi="Helvetica Neue" w:eastAsia="PingFang SC"/>
                 <w:sz w:val="18"/>
               </w:rPr>
-              <w:t>建设正式 100 例盲测集（脱敏、契约校验、双人标注、基线快照）</w:t>
+              <w:t>Build the formal 100-case blind set (redaction, contract validation, dual annotation, baseline snapshot)</w:t>
             </w:r>
           </w:p>
         </w:tc>
@@ -5622,7 +5600,7 @@
                 <w:rFonts w:ascii="Helvetica Neue" w:hAnsi="Helvetica Neue" w:eastAsia="PingFang SC"/>
                 <w:sz w:val="18"/>
               </w:rPr>
-              <w:t>数据/评测</w:t>
+              <w:t>Data/Evaluation</w:t>
             </w:r>
           </w:p>
         </w:tc>
@@ -5652,7 +5630,7 @@
                 <w:rFonts w:ascii="Helvetica Neue" w:hAnsi="Helvetica Neue" w:eastAsia="PingFang SC"/>
                 <w:sz w:val="18"/>
               </w:rPr>
-              <w:t>Windows 实机冒烟验收（zip/哈希/插件/路径/CJK/CRLF）</w:t>
+              <w:t>Windows real-machine smoke acceptance (zip/hashes/plugin/paths/CJK/CRLF)</w:t>
             </w:r>
           </w:p>
         </w:tc>
@@ -5696,7 +5674,7 @@
                 <w:rFonts w:ascii="Helvetica Neue" w:hAnsi="Helvetica Neue" w:eastAsia="PingFang SC"/>
                 <w:sz w:val="18"/>
               </w:rPr>
-              <w:t>v1.0 宣布条件评审（评测 + 试点 + 兼容基线）</w:t>
+              <w:t>v1.0 announcement condition review (evaluation + pilot + compatibility baseline)</w:t>
             </w:r>
           </w:p>
         </w:tc>
@@ -5710,7 +5688,7 @@
                 <w:rFonts w:ascii="Helvetica Neue" w:hAnsi="Helvetica Neue" w:eastAsia="PingFang SC"/>
                 <w:sz w:val="18"/>
               </w:rPr>
-              <w:t>产品负责人</w:t>
+              <w:t>Product owner</w:t>
             </w:r>
           </w:p>
         </w:tc>
@@ -5740,7 +5718,7 @@
                 <w:rFonts w:ascii="Helvetica Neue" w:hAnsi="Helvetica Neue" w:eastAsia="PingFang SC"/>
                 <w:sz w:val="18"/>
               </w:rPr>
-              <w:t>试点招募与 28 天 playbook 执行、周报漏斗</w:t>
+              <w:t>Pilot recruitment and 28-day playbook execution, weekly funnel report</w:t>
             </w:r>
           </w:p>
         </w:tc>
@@ -5754,7 +5732,7 @@
                 <w:rFonts w:ascii="Helvetica Neue" w:hAnsi="Helvetica Neue" w:eastAsia="PingFang SC"/>
                 <w:sz w:val="18"/>
               </w:rPr>
-              <w:t>GTM/创始人</w:t>
+              <w:t>GTM/Founder</w:t>
             </w:r>
           </w:p>
         </w:tc>
@@ -5799,7 +5777,7 @@
                 <w:rFonts w:ascii="Helvetica Neue" w:hAnsi="Helvetica Neue" w:eastAsia="PingFang SC"/>
                 <w:sz w:val="18"/>
               </w:rPr>
-              <w:t>、模型配置去重、push Retry-After/分片、Homebrew cask 迁移、文档站链接检查进 CI、Windows 代码签名等</w:t>
+              <w:t>, model config deduplication, push Retry-After/sharding, Homebrew cask migration, docs-site link check in CI, Windows code signing, etc.</w:t>
             </w:r>
           </w:p>
         </w:tc>
@@ -5826,14 +5804,14 @@
           <w:rFonts w:ascii="Helvetica Neue" w:hAnsi="Helvetica Neue" w:eastAsia="PingFang SC"/>
           <w:sz w:val="21"/>
         </w:rPr>
-        <w:t xml:space="preserve">完整清单、验收标准与回滚流程见 </w:t>
+        <w:t xml:space="preserve">See </w:t>
       </w:r>
       <w:r>
         <w:rPr>
           <w:rFonts w:ascii="Helvetica Neue" w:hAnsi="Helvetica Neue" w:eastAsia="PingFang SC"/>
           <w:sz w:val="21"/>
         </w:rPr>
-        <w:t>下一步工作</w:t>
+        <w:t>Next steps (Chinese)</w:t>
       </w:r>
       <w:r>
         <w:rPr>
@@ -5848,7 +5826,7 @@
           <w:rFonts w:ascii="Helvetica Neue" w:hAnsi="Helvetica Neue" w:eastAsia="PingFang SC"/>
           <w:sz w:val="21"/>
         </w:rPr>
-        <w:t>。</w:t>
+        <w:t xml:space="preserve"> for the complete list, acceptance criteria and rollback process.</w:t>
       </w:r>
     </w:p>
     <w:p>
@@ -5856,7 +5834,7 @@
         <w:pStyle w:val="Heading1"/>
       </w:pPr>
       <w:r>
-        <w:t>15. 项目结构</w:t>
+        <w:t>15. Project Structure</w:t>
       </w:r>
     </w:p>
     <w:p>
@@ -5880,7 +5858,7 @@
           <w:color w:val="24292E"/>
           <w:sz w:val="17"/>
         </w:rPr>
-        <w:t>├── cmd/kubectl-triage/          # 程序入口</w:t>
+        <w:t>├── cmd/kubectl-triage/          # program entry point</w:t>
         <w:br/>
       </w:r>
       <w:r>
@@ -5898,7 +5876,7 @@
           <w:color w:val="24292E"/>
           <w:sz w:val="17"/>
         </w:rPr>
-        <w:t>│   ├── cli/                     # 命令、flag、退出码</w:t>
+        <w:t>│   ├── cli/                     # commands, flags, exit codes</w:t>
         <w:br/>
       </w:r>
       <w:r>
@@ -5907,7 +5885,7 @@
           <w:color w:val="24292E"/>
           <w:sz w:val="17"/>
         </w:rPr>
-        <w:t>│   ├── bundle/                  # 事故包加载/校验/脚手架/脱敏</w:t>
+        <w:t>│   ├── bundle/                  # bundle loading/validation/scaffolding/redaction</w:t>
         <w:br/>
       </w:r>
       <w:r>
@@ -5916,7 +5894,7 @@
           <w:color w:val="24292E"/>
           <w:sz w:val="17"/>
         </w:rPr>
-        <w:t>│   ├── redact/                  # 凭据识别与清洗</w:t>
+        <w:t>│   ├── redact/                  # credential detection and scrubbing</w:t>
         <w:br/>
       </w:r>
       <w:r>
@@ -5925,7 +5903,7 @@
           <w:color w:val="24292E"/>
           <w:sz w:val="17"/>
         </w:rPr>
-        <w:t>│   ├── evidence/                # 证据规范化/裁剪/stale/偏差</w:t>
+        <w:t>│   ├── evidence/                # evidence normalization/trimming/stale/skew</w:t>
         <w:br/>
       </w:r>
       <w:r>
@@ -5934,7 +5912,7 @@
           <w:color w:val="24292E"/>
           <w:sz w:val="17"/>
         </w:rPr>
-        <w:t>│   ├── analyze/                 # 分析编排 + rule/ + model/</w:t>
+        <w:t>│   ├── analyze/                 # analysis orchestration + rule/ + model/</w:t>
         <w:br/>
       </w:r>
       <w:r>
@@ -5943,7 +5921,7 @@
           <w:color w:val="24292E"/>
           <w:sz w:val="17"/>
         </w:rPr>
-        <w:t>│   ├── report/                  # JSON/Markdown 渲染</w:t>
+        <w:t>│   ├── report/                  # JSON/Markdown rendering</w:t>
         <w:br/>
       </w:r>
       <w:r>
@@ -5961,7 +5939,7 @@
           <w:color w:val="24292E"/>
           <w:sz w:val="17"/>
         </w:rPr>
-        <w:t>│   ├── eval/                    # 本地评测与集合校验</w:t>
+        <w:t>│   ├── eval/                    # local evaluation and set validation</w:t>
         <w:br/>
       </w:r>
       <w:r>
@@ -5970,7 +5948,7 @@
           <w:color w:val="24292E"/>
           <w:sz w:val="17"/>
         </w:rPr>
-        <w:t>│   ├── push/                    # 企业推送客户端</w:t>
+        <w:t>│   ├── push/                    # enterprise push client</w:t>
         <w:br/>
       </w:r>
       <w:r>
@@ -5979,7 +5957,7 @@
           <w:color w:val="24292E"/>
           <w:sz w:val="17"/>
         </w:rPr>
-        <w:t>│   └── telemetry/               # opt-in 匿名遥测</w:t>
+        <w:t>│   └── telemetry/               # opt-in anonymous telemetry</w:t>
         <w:br/>
       </w:r>
       <w:r>
@@ -5988,7 +5966,7 @@
           <w:color w:val="24292E"/>
           <w:sz w:val="17"/>
         </w:rPr>
-        <w:t>├── pkg/schema/                  # 公开 schema + 校验器 + 兼容基线</w:t>
+        <w:t>├── pkg/schema/                  # public schemas + validator + compatibility baseline</w:t>
         <w:br/>
       </w:r>
       <w:r>
@@ -5997,7 +5975,7 @@
           <w:color w:val="24292E"/>
           <w:sz w:val="17"/>
         </w:rPr>
-        <w:t>├── testdata/golden/             # 12 个 golden 事故包</w:t>
+        <w:t>├── testdata/golden/             # 12 golden incident bundles</w:t>
         <w:br/>
       </w:r>
       <w:r>
@@ -6006,7 +5984,7 @@
           <w:color w:val="24292E"/>
           <w:sz w:val="17"/>
         </w:rPr>
-        <w:t>├── examples/oom/                # 5 分钟示例</w:t>
+        <w:t>├── examples/oom/                # 5-minute example</w:t>
         <w:br/>
       </w:r>
       <w:r>
@@ -6015,7 +5993,7 @@
           <w:color w:val="24292E"/>
           <w:sz w:val="17"/>
         </w:rPr>
-        <w:t>├── docs/                        # 需求/计划/ADR/安装/安全/评测/协议…</w:t>
+        <w:t>├── docs/                        # requirements/plan/ADRs/install/security/eval/protocol…</w:t>
         <w:br/>
       </w:r>
       <w:r>
@@ -6024,7 +6002,7 @@
           <w:color w:val="24292E"/>
           <w:sz w:val="17"/>
         </w:rPr>
-        <w:t>├── site/                        # 静态文档站（GitHub Pages）</w:t>
+        <w:t>├── site/                        # static documentation site (GitHub Pages)</w:t>
         <w:br/>
       </w:r>
       <w:r>
@@ -6041,7 +6019,24 @@
         <w:pStyle w:val="Heading1"/>
       </w:pPr>
       <w:r>
-        <w:t>16. 文档索引</w:t>
+        <w:t>16. Documentation Index</w:t>
+      </w:r>
+    </w:p>
+    <w:p>
+      <w:pPr>
+        <w:spacing w:before="120" w:after="120"/>
+        <w:ind w:left="227"/>
+        <w:pBdr>
+          <w:left w:val="single" w:sz="12" w:space="6" w:color="9DB7D5"/>
+        </w:pBdr>
+      </w:pPr>
+      <w:r>
+        <w:rPr>
+          <w:rFonts w:ascii="Helvetica Neue" w:hAnsi="Helvetica Neue" w:eastAsia="PingFang SC"/>
+          <w:color w:val="595959"/>
+          <w:sz w:val="19"/>
+        </w:rPr>
+        <w:t>Most deep-dive guides are currently Chinese-only; links marked (Chinese) point to Chinese documents.</w:t>
       </w:r>
     </w:p>
     <w:tbl>
@@ -6068,7 +6063,7 @@
                 <w:b/>
                 <w:sz w:val="18"/>
               </w:rPr>
-              <w:t>文档</w:t>
+              <w:t>Document</w:t>
             </w:r>
           </w:p>
         </w:tc>
@@ -6084,7 +6079,7 @@
                 <w:b/>
                 <w:sz w:val="18"/>
               </w:rPr>
-              <w:t>内容</w:t>
+              <w:t>Content</w:t>
             </w:r>
           </w:p>
         </w:tc>
@@ -6100,7 +6095,7 @@
                 <w:rFonts w:ascii="Helvetica Neue" w:hAnsi="Helvetica Neue" w:eastAsia="PingFang SC"/>
                 <w:sz w:val="18"/>
               </w:rPr>
-              <w:t>需求文档</w:t>
+              <w:t>Requirements (Chinese)</w:t>
             </w:r>
             <w:r>
               <w:rPr>
@@ -6122,7 +6117,7 @@
                 <w:rFonts w:ascii="Helvetica Neue" w:hAnsi="Helvetica Neue" w:eastAsia="PingFang SC"/>
                 <w:sz w:val="18"/>
               </w:rPr>
-              <w:t>产品定位、CLI 交互、证据规范、开源/商业边界、指标与验收</w:t>
+              <w:t>Product positioning, CLI interaction, evidence spec, open-source/commercial boundary, metrics and acceptance</w:t>
             </w:r>
           </w:p>
         </w:tc>
@@ -6138,7 +6133,7 @@
                 <w:rFonts w:ascii="Helvetica Neue" w:hAnsi="Helvetica Neue" w:eastAsia="PingFang SC"/>
                 <w:sz w:val="18"/>
               </w:rPr>
-              <w:t>拆分计划</w:t>
+              <w:t>Split plan (Chinese)</w:t>
             </w:r>
             <w:r>
               <w:rPr>
@@ -6160,7 +6155,7 @@
                 <w:rFonts w:ascii="Helvetica Neue" w:hAnsi="Helvetica Neue" w:eastAsia="PingFang SC"/>
                 <w:sz w:val="18"/>
               </w:rPr>
-              <w:t>仓库拆分、模块结构、12 周里程碑、WBS、发布与度量</w:t>
+              <w:t>Repository split, module structure, 12-week milestones, WBS, release and metrics</w:t>
             </w:r>
           </w:p>
         </w:tc>
@@ -6176,7 +6171,7 @@
                 <w:rFonts w:ascii="Helvetica Neue" w:hAnsi="Helvetica Neue" w:eastAsia="PingFang SC"/>
                 <w:sz w:val="18"/>
               </w:rPr>
-              <w:t>ADR-002</w:t>
+              <w:t>ADR-002 (Chinese)</w:t>
             </w:r>
             <w:r>
               <w:rPr>
@@ -6198,7 +6193,7 @@
                 <w:rFonts w:ascii="Helvetica Neue" w:hAnsi="Helvetica Neue" w:eastAsia="PingFang SC"/>
                 <w:sz w:val="18"/>
               </w:rPr>
-              <w:t>ADR-007</w:t>
+              <w:t>ADR-007 (Chinese)</w:t>
             </w:r>
             <w:r>
               <w:rPr>
@@ -6220,7 +6215,7 @@
                 <w:rFonts w:ascii="Helvetica Neue" w:hAnsi="Helvetica Neue" w:eastAsia="PingFang SC"/>
                 <w:sz w:val="18"/>
               </w:rPr>
-              <w:t>各阶段冻结的实现口径</w:t>
+              <w:t>Frozen implementation decisions for each stage</w:t>
             </w:r>
           </w:p>
         </w:tc>
@@ -6236,7 +6231,7 @@
                 <w:rFonts w:ascii="Helvetica Neue" w:hAnsi="Helvetica Neue" w:eastAsia="PingFang SC"/>
                 <w:sz w:val="18"/>
               </w:rPr>
-              <w:t>5 分钟快速开始</w:t>
+              <w:t>5-minute quickstart (Chinese)</w:t>
             </w:r>
             <w:r>
               <w:rPr>
@@ -6258,7 +6253,7 @@
                 <w:rFonts w:ascii="Helvetica Neue" w:hAnsi="Helvetica Neue" w:eastAsia="PingFang SC"/>
                 <w:sz w:val="18"/>
               </w:rPr>
-              <w:t>安装、init、analyze、读报告、退出码</w:t>
+              <w:t>Install, init, analyze, read the report, exit codes</w:t>
             </w:r>
           </w:p>
         </w:tc>
@@ -6274,7 +6269,7 @@
                 <w:rFonts w:ascii="Helvetica Neue" w:hAnsi="Helvetica Neue" w:eastAsia="PingFang SC"/>
                 <w:sz w:val="18"/>
               </w:rPr>
-              <w:t>安装与校验</w:t>
+              <w:t>Install and verify (Chinese)</w:t>
             </w:r>
             <w:r>
               <w:rPr>
@@ -6296,7 +6291,7 @@
                 <w:rFonts w:ascii="Helvetica Neue" w:hAnsi="Helvetica Neue" w:eastAsia="PingFang SC"/>
                 <w:sz w:val="18"/>
               </w:rPr>
-              <w:t>Release 资产、sha256/cosign/SBOM、Docker、Windows、Homebrew</w:t>
+              <w:t>Release assets, sha256/cosign/SBOM, Docker, Windows, Homebrew</w:t>
             </w:r>
           </w:p>
         </w:tc>
@@ -6312,7 +6307,7 @@
                 <w:rFonts w:ascii="Helvetica Neue" w:hAnsi="Helvetica Neue" w:eastAsia="PingFang SC"/>
                 <w:sz w:val="18"/>
               </w:rPr>
-              <w:t>安全与数据流</w:t>
+              <w:t>Security and data flow (Chinese)</w:t>
             </w:r>
             <w:r>
               <w:rPr>
@@ -6334,7 +6329,7 @@
                 <w:rFonts w:ascii="Helvetica Neue" w:hAnsi="Helvetica Neue" w:eastAsia="PingFang SC"/>
                 <w:sz w:val="18"/>
               </w:rPr>
-              <w:t>边界、权限清单、数据流、遥测隐私、供应链</w:t>
+              <w:t>Boundary, permission inventory, data flow, telemetry privacy, supply chain</w:t>
             </w:r>
           </w:p>
         </w:tc>
@@ -6350,7 +6345,7 @@
                 <w:rFonts w:ascii="Helvetica Neue" w:hAnsi="Helvetica Neue" w:eastAsia="PingFang SC"/>
                 <w:sz w:val="18"/>
               </w:rPr>
-              <w:t>模型模式</w:t>
+              <w:t>Model mode (Chinese)</w:t>
             </w:r>
             <w:r>
               <w:rPr>
@@ -6372,7 +6367,7 @@
                 <w:rFonts w:ascii="Helvetica Neue" w:hAnsi="Helvetica Neue" w:eastAsia="PingFang SC"/>
                 <w:sz w:val="18"/>
               </w:rPr>
-              <w:t>Ollama/OpenAI-compatible、预算、降级与安全</w:t>
+              <w:t>Ollama/OpenAI-compatible, budget, degradation and security</w:t>
             </w:r>
           </w:p>
         </w:tc>
@@ -6388,7 +6383,7 @@
                 <w:rFonts w:ascii="Helvetica Neue" w:hAnsi="Helvetica Neue" w:eastAsia="PingFang SC"/>
                 <w:sz w:val="18"/>
               </w:rPr>
-              <w:t>本地评测</w:t>
+              <w:t>Local evaluation (Chinese)</w:t>
             </w:r>
             <w:r>
               <w:rPr>
@@ -6410,7 +6405,7 @@
                 <w:rFonts w:ascii="Helvetica Neue" w:hAnsi="Helvetica Neue" w:eastAsia="PingFang SC"/>
                 <w:sz w:val="18"/>
               </w:rPr>
-              <w:t>评测集契约</w:t>
+              <w:t>Evaluation-set contract (Chinese)</w:t>
             </w:r>
             <w:r>
               <w:rPr>
@@ -6432,7 +6427,7 @@
                 <w:rFonts w:ascii="Helvetica Neue" w:hAnsi="Helvetica Neue" w:eastAsia="PingFang SC"/>
                 <w:sz w:val="18"/>
               </w:rPr>
-              <w:t>eval 用法、评分、正式集契约与 --validate</w:t>
+              <w:t>eval usage, scoring, formal-set contract and --validate</w:t>
             </w:r>
           </w:p>
         </w:tc>
@@ -6448,7 +6443,7 @@
                 <w:rFonts w:ascii="Helvetica Neue" w:hAnsi="Helvetica Neue" w:eastAsia="PingFang SC"/>
                 <w:sz w:val="18"/>
               </w:rPr>
-              <w:t>push 协议 v1.0</w:t>
+              <w:t>push protocol v1.0 (Chinese)</w:t>
             </w:r>
             <w:r>
               <w:rPr>
@@ -6470,7 +6465,7 @@
                 <w:rFonts w:ascii="Helvetica Neue" w:hAnsi="Helvetica Neue" w:eastAsia="PingFang SC"/>
                 <w:sz w:val="18"/>
               </w:rPr>
-              <w:t>企业版边界</w:t>
+              <w:t>Enterprise boundary (Chinese)</w:t>
             </w:r>
             <w:r>
               <w:rPr>
@@ -6492,7 +6487,7 @@
                 <w:rFonts w:ascii="Helvetica Neue" w:hAnsi="Helvetica Neue" w:eastAsia="PingFang SC"/>
                 <w:sz w:val="18"/>
               </w:rPr>
-              <w:t>企业推送协议与开源/商业边界</w:t>
+              <w:t>Enterprise push protocol and open-source/commercial boundary</w:t>
             </w:r>
           </w:p>
         </w:tc>
@@ -6508,7 +6503,7 @@
                 <w:rFonts w:ascii="Helvetica Neue" w:hAnsi="Helvetica Neue" w:eastAsia="PingFang SC"/>
                 <w:sz w:val="18"/>
               </w:rPr>
-              <w:t>试点 playbook</w:t>
+              <w:t>Pilot playbook (Chinese)</w:t>
             </w:r>
             <w:r>
               <w:rPr>
@@ -6530,7 +6525,7 @@
                 <w:rFonts w:ascii="Helvetica Neue" w:hAnsi="Helvetica Neue" w:eastAsia="PingFang SC"/>
                 <w:sz w:val="18"/>
               </w:rPr>
-              <w:t>指标漏斗</w:t>
+              <w:t>Metrics funnel (Chinese)</w:t>
             </w:r>
             <w:r>
               <w:rPr>
@@ -6552,7 +6547,7 @@
                 <w:rFonts w:ascii="Helvetica Neue" w:hAnsi="Helvetica Neue" w:eastAsia="PingFang SC"/>
                 <w:sz w:val="18"/>
               </w:rPr>
-              <w:t>28 天试点运营与北极星指标</w:t>
+              <w:t>28-day pilot operations and north-star metrics</w:t>
             </w:r>
           </w:p>
         </w:tc>
@@ -6568,7 +6563,7 @@
                 <w:rFonts w:ascii="Helvetica Neue" w:hAnsi="Helvetica Neue" w:eastAsia="PingFang SC"/>
                 <w:sz w:val="18"/>
               </w:rPr>
-              <w:t>schema 契约</w:t>
+              <w:t>Schema contract (Chinese)</w:t>
             </w:r>
             <w:r>
               <w:rPr>
@@ -6590,7 +6585,7 @@
                 <w:rFonts w:ascii="Helvetica Neue" w:hAnsi="Helvetica Neue" w:eastAsia="PingFang SC"/>
                 <w:sz w:val="18"/>
               </w:rPr>
-              <w:t>报告/incident 字段与兼容策略</w:t>
+              <w:t>Report/incident fields and compatibility policy</w:t>
             </w:r>
           </w:p>
         </w:tc>
@@ -6606,7 +6601,7 @@
                 <w:rFonts w:ascii="Helvetica Neue" w:hAnsi="Helvetica Neue" w:eastAsia="PingFang SC"/>
                 <w:sz w:val="18"/>
               </w:rPr>
-              <w:t>下一步工作</w:t>
+              <w:t>Next steps (Chinese)</w:t>
             </w:r>
             <w:r>
               <w:rPr>
@@ -6628,7 +6623,7 @@
                 <w:rFonts w:ascii="Helvetica Neue" w:hAnsi="Helvetica Neue" w:eastAsia="PingFang SC"/>
                 <w:sz w:val="18"/>
               </w:rPr>
-              <w:t>v1.0 条件、P0/P1/P2、发布与回滚</w:t>
+              <w:t>v1.0 conditions, P0/P1/P2, release and rollback</w:t>
             </w:r>
           </w:p>
         </w:tc>
@@ -6640,7 +6635,7 @@
         <w:pStyle w:val="Heading1"/>
       </w:pPr>
       <w:r>
-        <w:t>17. 贡献、许可与安全披露</w:t>
+        <w:t>17. Contributing, License and Security Disclosure</w:t>
       </w:r>
     </w:p>
     <w:p>
@@ -6652,7 +6647,7 @@
           <w:rFonts w:ascii="Helvetica Neue" w:hAnsi="Helvetica Neue" w:eastAsia="PingFang SC"/>
           <w:sz w:val="21"/>
         </w:rPr>
-        <w:t>贡献流程：</w:t>
+        <w:t xml:space="preserve">Contribution process: </w:t>
       </w:r>
       <w:r>
         <w:rPr>
@@ -6674,7 +6669,7 @@
           <w:rFonts w:ascii="Helvetica Neue" w:hAnsi="Helvetica Neue" w:eastAsia="PingFang SC"/>
           <w:sz w:val="21"/>
         </w:rPr>
-        <w:t>（DCO，无需 CLA；不提交真实客户数据/凭据）；</w:t>
+        <w:t xml:space="preserve"> (DCO, no CLA required; never commit real customer data/credentials);</w:t>
       </w:r>
     </w:p>
     <w:p>
@@ -6686,7 +6681,7 @@
           <w:rFonts w:ascii="Helvetica Neue" w:hAnsi="Helvetica Neue" w:eastAsia="PingFang SC"/>
           <w:sz w:val="21"/>
         </w:rPr>
-        <w:t>许可：Apache-2.0（</w:t>
+        <w:t>License: Apache-2.0 (</w:t>
       </w:r>
       <w:r>
         <w:rPr>
@@ -6708,7 +6703,7 @@
           <w:rFonts w:ascii="Helvetica Neue" w:hAnsi="Helvetica Neue" w:eastAsia="PingFang SC"/>
           <w:sz w:val="21"/>
         </w:rPr>
-        <w:t>）；</w:t>
+        <w:t>);</w:t>
       </w:r>
     </w:p>
     <w:p>
@@ -6720,7 +6715,7 @@
           <w:rFonts w:ascii="Helvetica Neue" w:hAnsi="Helvetica Neue" w:eastAsia="PingFang SC"/>
           <w:sz w:val="21"/>
         </w:rPr>
-        <w:t xml:space="preserve">安全披露：请勿公开 issue，按 </w:t>
+        <w:t xml:space="preserve">Security disclosure: do not open a public issue; report privately via </w:t>
       </w:r>
       <w:r>
         <w:rPr>
@@ -6742,7 +6737,7 @@
           <w:rFonts w:ascii="Helvetica Neue" w:hAnsi="Helvetica Neue" w:eastAsia="PingFang SC"/>
           <w:sz w:val="21"/>
         </w:rPr>
-        <w:t xml:space="preserve"> 私密上报；</w:t>
+        <w:t>;</w:t>
       </w:r>
     </w:p>
     <w:p>
@@ -6754,7 +6749,7 @@
           <w:rFonts w:ascii="Helvetica Neue" w:hAnsi="Helvetica Neue" w:eastAsia="PingFang SC"/>
           <w:sz w:val="21"/>
         </w:rPr>
-        <w:t>行为准则：</w:t>
+        <w:t xml:space="preserve">Code of conduct: </w:t>
       </w:r>
       <w:r>
         <w:rPr>
@@ -6776,7 +6771,7 @@
           <w:rFonts w:ascii="Helvetica Neue" w:hAnsi="Helvetica Neue" w:eastAsia="PingFang SC"/>
           <w:sz w:val="21"/>
         </w:rPr>
-        <w:t>。</w:t>
+        <w:t>.</w:t>
       </w:r>
     </w:p>
     <w:sectPr>
@@ -6804,7 +6799,7 @@
         <w:color w:val="595959"/>
         <w:sz w:val="17"/>
       </w:rPr>
-      <w:t xml:space="preserve">kubectl-triage · Apache-2.0 · 第 </w:t>
+      <w:t xml:space="preserve">kubectl-triage · Apache-2.0 · Page </w:t>
     </w:r>
     <w:r>
       <w:rPr>
@@ -6822,7 +6817,6 @@
         <w:color w:val="595959"/>
         <w:sz w:val="17"/>
       </w:rPr>
-      <w:t xml:space="preserve"> 页</w:t>
     </w:r>
   </w:p>
 </w:ftr>
@@ -6841,7 +6835,7 @@
         <w:color w:val="595959"/>
         <w:sz w:val="17"/>
       </w:rPr>
-      <w:t>kubectl-triage 项目文档 · v0.5.0</w:t>
+      <w:t>kubectl-triage Project Documentation · v0.5.0</w:t>
     </w:r>
   </w:p>
 </w:hdr>

</xml_diff>